<commit_message>
vault backup: 2026-01-15 16:43:27
</commit_message>
<xml_diff>
--- a/Курс 3/Базы данных/Лабораторные/07. SQL. Язык манипулирования данными (DML)/Документ Microsoft Word.docx
+++ b/Курс 3/Базы данных/Лабораторные/07. SQL. Язык манипулирования данными (DML)/Документ Microsoft Word.docx
@@ -4,28 +4,806 @@
   <w:body>
     <w:p>
       <w:pPr>
-        <w:pStyle w:val="a3"/>
+        <w:jc w:val="both"/>
         <w:rPr>
-          <w:lang w:val="en-US"/>
+          <w:rFonts w:eastAsia="Times New Roman" w:cs="Times New Roman"/>
+          <w:kern w:val="2"/>
+          <w:sz w:val="24"/>
+          <w:szCs w:val="24"/>
+          <w:lang w:eastAsia="ru-RU"/>
+          <w14:ligatures w14:val="standardContextual"/>
+        </w:rPr>
+      </w:pPr>
+    </w:p>
+    <w:p>
+      <w:pPr>
+        <w:shd w:val="clear" w:color="auto" w:fill="FFFFFF"/>
+        <w:jc w:val="center"/>
+        <w:rPr>
+          <w:rFonts w:eastAsia="Times New Roman" w:cs="Times New Roman"/>
+          <w:color w:val="000000"/>
+          <w:spacing w:val="-9"/>
+          <w:kern w:val="2"/>
+          <w:szCs w:val="24"/>
+          <w:lang w:eastAsia="ru-RU"/>
+          <w14:ligatures w14:val="standardContextual"/>
         </w:rPr>
       </w:pPr>
       <w:r>
         <w:rPr>
-          <w:lang w:val="en-US"/>
+          <w:rFonts w:eastAsia="Times New Roman" w:cs="Times New Roman"/>
+          <w:color w:val="000000"/>
+          <w:spacing w:val="-9"/>
+          <w:kern w:val="2"/>
+          <w:szCs w:val="24"/>
+          <w:lang w:eastAsia="ru-RU"/>
+          <w14:ligatures w14:val="standardContextual"/>
         </w:rPr>
-        <w:t>SQL</w:t>
+        <w:t>Институт информационных технологий</w:t>
       </w:r>
+    </w:p>
+    <w:p>
+      <w:pPr>
+        <w:jc w:val="both"/>
+        <w:rPr>
+          <w:rFonts w:eastAsia="Times New Roman" w:cs="Times New Roman"/>
+          <w:kern w:val="2"/>
+          <w:sz w:val="24"/>
+          <w:szCs w:val="24"/>
+          <w:lang w:eastAsia="ru-RU"/>
+          <w14:ligatures w14:val="standardContextual"/>
+        </w:rPr>
+      </w:pPr>
+    </w:p>
+    <w:p>
+      <w:pPr>
+        <w:jc w:val="both"/>
+        <w:rPr>
+          <w:rFonts w:eastAsia="Times New Roman" w:cs="Times New Roman"/>
+          <w:kern w:val="2"/>
+          <w:sz w:val="24"/>
+          <w:szCs w:val="24"/>
+          <w:lang w:eastAsia="ru-RU"/>
+          <w14:ligatures w14:val="standardContextual"/>
+        </w:rPr>
+      </w:pPr>
+    </w:p>
+    <w:p>
+      <w:pPr>
+        <w:shd w:val="clear" w:color="auto" w:fill="FFFFFF"/>
+        <w:jc w:val="both"/>
+        <w:rPr>
+          <w:rFonts w:eastAsia="Times New Roman" w:cs="Times New Roman"/>
+          <w:color w:val="000000"/>
+          <w:kern w:val="2"/>
+          <w:sz w:val="21"/>
+          <w:szCs w:val="24"/>
+          <w:lang w:eastAsia="ru-RU"/>
+          <w14:ligatures w14:val="standardContextual"/>
+        </w:rPr>
+      </w:pPr>
+    </w:p>
+    <w:p>
+      <w:pPr>
+        <w:shd w:val="clear" w:color="auto" w:fill="FFFFFF"/>
+        <w:jc w:val="both"/>
+        <w:rPr>
+          <w:rFonts w:eastAsia="Times New Roman" w:cs="Times New Roman"/>
+          <w:color w:val="000000"/>
+          <w:kern w:val="2"/>
+          <w:szCs w:val="28"/>
+          <w:lang w:eastAsia="ru-RU"/>
+          <w14:ligatures w14:val="standardContextual"/>
+        </w:rPr>
+      </w:pPr>
+    </w:p>
+    <w:p>
+      <w:pPr>
+        <w:shd w:val="clear" w:color="auto" w:fill="FFFFFF"/>
+        <w:ind w:left="4820" w:firstLine="40"/>
+        <w:jc w:val="both"/>
+        <w:rPr>
+          <w:rFonts w:eastAsia="Times New Roman" w:cs="Times New Roman"/>
+          <w:color w:val="000000"/>
+          <w:spacing w:val="-9"/>
+          <w:kern w:val="2"/>
+          <w:szCs w:val="28"/>
+          <w:lang w:eastAsia="ru-RU"/>
+          <w14:ligatures w14:val="standardContextual"/>
+        </w:rPr>
+      </w:pPr>
       <w:r>
-        <w:t>. Язык манипулирования данными (</w:t>
+        <w:rPr>
+          <w:rFonts w:eastAsia="Times New Roman" w:cs="Times New Roman"/>
+          <w:color w:val="000000"/>
+          <w:spacing w:val="-9"/>
+          <w:kern w:val="2"/>
+          <w:szCs w:val="28"/>
+          <w:lang w:eastAsia="ru-RU"/>
+          <w14:ligatures w14:val="standardContextual"/>
+        </w:rPr>
+        <w:t>Кафедра: Математическое и программное обеспечение ЭВМ</w:t>
+      </w:r>
+    </w:p>
+    <w:p>
+      <w:pPr>
+        <w:shd w:val="clear" w:color="auto" w:fill="FFFFFF"/>
+        <w:ind w:left="4820" w:firstLine="0"/>
+        <w:jc w:val="both"/>
+        <w:rPr>
+          <w:rFonts w:eastAsia="Times New Roman" w:cs="Times New Roman"/>
+          <w:kern w:val="2"/>
+          <w:szCs w:val="28"/>
+          <w:lang w:eastAsia="ru-RU"/>
+          <w14:ligatures w14:val="standardContextual"/>
+        </w:rPr>
+      </w:pPr>
+      <w:r>
+        <w:rPr>
+          <w:rFonts w:eastAsia="Times New Roman" w:cs="Times New Roman"/>
+          <w:color w:val="000000"/>
+          <w:kern w:val="2"/>
+          <w:szCs w:val="28"/>
+          <w:lang w:eastAsia="ru-RU"/>
+          <w14:ligatures w14:val="standardContextual"/>
+        </w:rPr>
+        <w:t>Дисциплина: Базы данных</w:t>
+      </w:r>
+    </w:p>
+    <w:p>
+      <w:pPr>
+        <w:shd w:val="clear" w:color="auto" w:fill="FFFFFF"/>
+        <w:rPr>
+          <w:rFonts w:eastAsia="Times New Roman" w:cs="Times New Roman"/>
+          <w:color w:val="000000"/>
+          <w:kern w:val="2"/>
+          <w:sz w:val="21"/>
+          <w:szCs w:val="24"/>
+          <w:lang w:eastAsia="ru-RU"/>
+          <w14:ligatures w14:val="standardContextual"/>
+        </w:rPr>
+      </w:pPr>
+    </w:p>
+    <w:p>
+      <w:pPr>
+        <w:shd w:val="clear" w:color="auto" w:fill="FFFFFF"/>
+        <w:jc w:val="center"/>
+        <w:rPr>
+          <w:rFonts w:eastAsia="Times New Roman" w:cs="Times New Roman"/>
+          <w:color w:val="000000"/>
+          <w:kern w:val="2"/>
+          <w:sz w:val="21"/>
+          <w:szCs w:val="24"/>
+          <w:lang w:eastAsia="ru-RU"/>
+          <w14:ligatures w14:val="standardContextual"/>
+        </w:rPr>
+      </w:pPr>
+    </w:p>
+    <w:p>
+      <w:pPr>
+        <w:shd w:val="clear" w:color="auto" w:fill="FFFFFF"/>
+        <w:jc w:val="center"/>
+        <w:rPr>
+          <w:rFonts w:eastAsia="Times New Roman" w:cs="Times New Roman"/>
+          <w:color w:val="000000"/>
+          <w:kern w:val="2"/>
+          <w:sz w:val="21"/>
+          <w:szCs w:val="24"/>
+          <w:lang w:eastAsia="ru-RU"/>
+          <w14:ligatures w14:val="standardContextual"/>
+        </w:rPr>
+      </w:pPr>
+    </w:p>
+    <w:p>
+      <w:pPr>
+        <w:shd w:val="clear" w:color="auto" w:fill="FFFFFF"/>
+        <w:jc w:val="center"/>
+        <w:rPr>
+          <w:rFonts w:eastAsia="Times New Roman" w:cs="Times New Roman"/>
+          <w:color w:val="000000"/>
+          <w:kern w:val="2"/>
+          <w:sz w:val="21"/>
+          <w:szCs w:val="24"/>
+          <w:lang w:eastAsia="ru-RU"/>
+          <w14:ligatures w14:val="standardContextual"/>
+        </w:rPr>
+      </w:pPr>
+    </w:p>
+    <w:p>
+      <w:pPr>
+        <w:shd w:val="clear" w:color="auto" w:fill="FFFFFF"/>
+        <w:jc w:val="center"/>
+        <w:rPr>
+          <w:rFonts w:eastAsia="Times New Roman" w:cs="Times New Roman"/>
+          <w:color w:val="000000"/>
+          <w:kern w:val="2"/>
+          <w:sz w:val="21"/>
+          <w:szCs w:val="24"/>
+          <w:lang w:eastAsia="ru-RU"/>
+          <w14:ligatures w14:val="standardContextual"/>
+        </w:rPr>
+      </w:pPr>
+    </w:p>
+    <w:p>
+      <w:pPr>
+        <w:shd w:val="clear" w:color="auto" w:fill="FFFFFF"/>
+        <w:jc w:val="center"/>
+        <w:rPr>
+          <w:rFonts w:eastAsia="Times New Roman" w:cs="Times New Roman"/>
+          <w:color w:val="000000"/>
+          <w:kern w:val="2"/>
+          <w:sz w:val="21"/>
+          <w:szCs w:val="24"/>
+          <w:lang w:eastAsia="ru-RU"/>
+          <w14:ligatures w14:val="standardContextual"/>
+        </w:rPr>
+      </w:pPr>
+    </w:p>
+    <w:p>
+      <w:pPr>
+        <w:shd w:val="clear" w:color="auto" w:fill="FFFFFF"/>
+        <w:jc w:val="center"/>
+        <w:rPr>
+          <w:rFonts w:eastAsia="Times New Roman" w:cs="Times New Roman"/>
+          <w:color w:val="000000"/>
+          <w:kern w:val="2"/>
+          <w:sz w:val="21"/>
+          <w:szCs w:val="24"/>
+          <w:lang w:eastAsia="ru-RU"/>
+          <w14:ligatures w14:val="standardContextual"/>
+        </w:rPr>
+      </w:pPr>
+    </w:p>
+    <w:p>
+      <w:pPr>
+        <w:shd w:val="clear" w:color="auto" w:fill="FFFFFF"/>
+        <w:jc w:val="center"/>
+        <w:rPr>
+          <w:rFonts w:eastAsia="Times New Roman" w:cs="Times New Roman"/>
+          <w:color w:val="000000"/>
+          <w:kern w:val="2"/>
+          <w:sz w:val="21"/>
+          <w:szCs w:val="24"/>
+          <w:lang w:eastAsia="ru-RU"/>
+          <w14:ligatures w14:val="standardContextual"/>
+        </w:rPr>
+      </w:pPr>
+    </w:p>
+    <w:p>
+      <w:pPr>
+        <w:shd w:val="clear" w:color="auto" w:fill="FFFFFF"/>
+        <w:jc w:val="center"/>
+        <w:rPr>
+          <w:rFonts w:eastAsia="Times New Roman" w:cs="Times New Roman"/>
+          <w:color w:val="000000"/>
+          <w:kern w:val="2"/>
+          <w:sz w:val="21"/>
+          <w:szCs w:val="24"/>
+          <w:lang w:eastAsia="ru-RU"/>
+          <w14:ligatures w14:val="standardContextual"/>
+        </w:rPr>
+      </w:pPr>
+    </w:p>
+    <w:p>
+      <w:pPr>
+        <w:shd w:val="clear" w:color="auto" w:fill="FFFFFF"/>
+        <w:jc w:val="center"/>
+        <w:rPr>
+          <w:rFonts w:eastAsia="Times New Roman" w:cs="Times New Roman"/>
+          <w:color w:val="000000"/>
+          <w:kern w:val="2"/>
+          <w:sz w:val="21"/>
+          <w:szCs w:val="24"/>
+          <w:lang w:eastAsia="ru-RU"/>
+          <w14:ligatures w14:val="standardContextual"/>
+        </w:rPr>
+      </w:pPr>
+    </w:p>
+    <w:p>
+      <w:pPr>
+        <w:shd w:val="clear" w:color="auto" w:fill="FFFFFF"/>
+        <w:jc w:val="center"/>
+        <w:rPr>
+          <w:rFonts w:eastAsia="Times New Roman" w:cs="Times New Roman"/>
+          <w:kern w:val="2"/>
+          <w:szCs w:val="24"/>
+          <w:lang w:eastAsia="ru-RU"/>
+          <w14:ligatures w14:val="standardContextual"/>
+        </w:rPr>
+      </w:pPr>
+      <w:r>
+        <w:rPr>
+          <w:rFonts w:eastAsia="Times New Roman" w:cs="Times New Roman"/>
+          <w:color w:val="000000"/>
+          <w:spacing w:val="-12"/>
+          <w:kern w:val="2"/>
+          <w:szCs w:val="24"/>
+          <w:lang w:eastAsia="ru-RU"/>
+          <w14:ligatures w14:val="standardContextual"/>
+        </w:rPr>
+        <w:t xml:space="preserve">ЛАБОРАТОРНАЯ РАБОТА № </w:t>
       </w:r>
       <w:r>
         <w:rPr>
-          <w:lang w:val="en-US"/>
+          <w:rFonts w:eastAsia="Times New Roman" w:cs="Times New Roman"/>
+          <w:color w:val="000000"/>
+          <w:spacing w:val="-12"/>
+          <w:kern w:val="2"/>
+          <w:szCs w:val="24"/>
+          <w:lang w:eastAsia="ru-RU"/>
+          <w14:ligatures w14:val="standardContextual"/>
         </w:rPr>
-        <w:t>DML</w:t>
+        <w:t>7</w:t>
+      </w:r>
+    </w:p>
+    <w:p>
+      <w:pPr>
+        <w:shd w:val="clear" w:color="auto" w:fill="FFFFFF"/>
+        <w:jc w:val="center"/>
+        <w:rPr>
+          <w:rFonts w:eastAsia="Times New Roman" w:cs="Times New Roman"/>
+          <w:color w:val="000000"/>
+          <w:spacing w:val="-8"/>
+          <w:kern w:val="2"/>
+          <w:szCs w:val="24"/>
+          <w:lang w:eastAsia="ru-RU"/>
+          <w14:ligatures w14:val="standardContextual"/>
+        </w:rPr>
+      </w:pPr>
+    </w:p>
+    <w:p>
+      <w:pPr>
+        <w:shd w:val="clear" w:color="auto" w:fill="FFFFFF"/>
+        <w:spacing w:line="360" w:lineRule="auto"/>
+        <w:jc w:val="center"/>
+        <w:rPr>
+          <w:rFonts w:eastAsia="Times New Roman" w:cs="Times New Roman"/>
+          <w:color w:val="000000"/>
+          <w:spacing w:val="-11"/>
+          <w:kern w:val="2"/>
+          <w:sz w:val="24"/>
+          <w:szCs w:val="24"/>
+          <w:lang w:eastAsia="ru-RU"/>
+          <w14:ligatures w14:val="standardContextual"/>
+        </w:rPr>
+      </w:pPr>
+      <w:r>
+        <w:rPr>
+          <w:rFonts w:eastAsia="Aptos" w:cs="Times New Roman"/>
+          <w:kern w:val="2"/>
+          <w:sz w:val="32"/>
+          <w:szCs w:val="24"/>
+          <w14:ligatures w14:val="standardContextual"/>
+        </w:rPr>
+        <w:t>SQL. Язык манипулирования данными (DML)</w:t>
+      </w:r>
+    </w:p>
+    <w:p>
+      <w:pPr>
+        <w:shd w:val="clear" w:color="auto" w:fill="FFFFFF"/>
+        <w:spacing w:line="360" w:lineRule="auto"/>
+        <w:jc w:val="center"/>
+        <w:rPr>
+          <w:rFonts w:eastAsia="Times New Roman" w:cs="Times New Roman"/>
+          <w:color w:val="000000"/>
+          <w:spacing w:val="-11"/>
+          <w:kern w:val="2"/>
+          <w:sz w:val="24"/>
+          <w:szCs w:val="24"/>
+          <w:lang w:eastAsia="ru-RU"/>
+          <w14:ligatures w14:val="standardContextual"/>
+        </w:rPr>
+      </w:pPr>
+    </w:p>
+    <w:p>
+      <w:pPr>
+        <w:shd w:val="clear" w:color="auto" w:fill="FFFFFF"/>
+        <w:spacing w:line="360" w:lineRule="auto"/>
+        <w:jc w:val="center"/>
+        <w:rPr>
+          <w:rFonts w:eastAsia="Times New Roman" w:cs="Times New Roman"/>
+          <w:color w:val="000000"/>
+          <w:spacing w:val="-11"/>
+          <w:kern w:val="2"/>
+          <w:sz w:val="24"/>
+          <w:szCs w:val="24"/>
+          <w:lang w:val="en-US" w:eastAsia="ru-RU"/>
+          <w14:ligatures w14:val="standardContextual"/>
+        </w:rPr>
+      </w:pPr>
+    </w:p>
+    <w:p>
+      <w:pPr>
+        <w:shd w:val="clear" w:color="auto" w:fill="FFFFFF"/>
+        <w:spacing w:line="360" w:lineRule="auto"/>
+        <w:jc w:val="center"/>
+        <w:rPr>
+          <w:rFonts w:eastAsia="Times New Roman" w:cs="Times New Roman"/>
+          <w:color w:val="000000"/>
+          <w:spacing w:val="-11"/>
+          <w:kern w:val="2"/>
+          <w:sz w:val="24"/>
+          <w:szCs w:val="24"/>
+          <w:lang w:val="en-US" w:eastAsia="ru-RU"/>
+          <w14:ligatures w14:val="standardContextual"/>
+        </w:rPr>
+      </w:pPr>
+    </w:p>
+    <w:p>
+      <w:pPr>
+        <w:shd w:val="clear" w:color="auto" w:fill="FFFFFF"/>
+        <w:spacing w:line="360" w:lineRule="auto"/>
+        <w:jc w:val="center"/>
+        <w:rPr>
+          <w:rFonts w:eastAsia="Times New Roman" w:cs="Times New Roman"/>
+          <w:color w:val="000000"/>
+          <w:spacing w:val="-11"/>
+          <w:kern w:val="2"/>
+          <w:sz w:val="24"/>
+          <w:szCs w:val="24"/>
+          <w:lang w:val="en-US" w:eastAsia="ru-RU"/>
+          <w14:ligatures w14:val="standardContextual"/>
+        </w:rPr>
+      </w:pPr>
+    </w:p>
+    <w:p>
+      <w:pPr>
+        <w:shd w:val="clear" w:color="auto" w:fill="FFFFFF"/>
+        <w:spacing w:line="360" w:lineRule="auto"/>
+        <w:jc w:val="center"/>
+        <w:rPr>
+          <w:rFonts w:eastAsia="Times New Roman" w:cs="Times New Roman"/>
+          <w:color w:val="000000"/>
+          <w:spacing w:val="-11"/>
+          <w:kern w:val="2"/>
+          <w:sz w:val="24"/>
+          <w:szCs w:val="24"/>
+          <w:lang w:eastAsia="ru-RU"/>
+          <w14:ligatures w14:val="standardContextual"/>
+        </w:rPr>
+      </w:pPr>
+    </w:p>
+    <w:p>
+      <w:pPr>
+        <w:shd w:val="clear" w:color="auto" w:fill="FFFFFF"/>
+        <w:spacing w:line="360" w:lineRule="auto"/>
+        <w:jc w:val="center"/>
+        <w:rPr>
+          <w:rFonts w:eastAsia="Times New Roman" w:cs="Times New Roman"/>
+          <w:color w:val="000000"/>
+          <w:spacing w:val="-11"/>
+          <w:kern w:val="2"/>
+          <w:sz w:val="24"/>
+          <w:szCs w:val="24"/>
+          <w:lang w:eastAsia="ru-RU"/>
+          <w14:ligatures w14:val="standardContextual"/>
+        </w:rPr>
+      </w:pPr>
+    </w:p>
+    <w:p>
+      <w:pPr>
+        <w:shd w:val="clear" w:color="auto" w:fill="FFFFFF"/>
+        <w:tabs>
+          <w:tab w:val="left" w:pos="3600"/>
+        </w:tabs>
+        <w:jc w:val="both"/>
+        <w:rPr>
+          <w:rFonts w:eastAsia="Times New Roman" w:cs="Times New Roman"/>
+          <w:color w:val="000000"/>
+          <w:spacing w:val="-10"/>
+          <w:kern w:val="2"/>
+          <w:szCs w:val="28"/>
+          <w:lang w:eastAsia="ru-RU"/>
+          <w14:ligatures w14:val="standardContextual"/>
+        </w:rPr>
+      </w:pPr>
+      <w:r>
+        <w:rPr>
+          <w:rFonts w:eastAsia="Times New Roman" w:cs="Times New Roman"/>
+          <w:color w:val="000000"/>
+          <w:spacing w:val="-11"/>
+          <w:kern w:val="2"/>
+          <w:szCs w:val="28"/>
+          <w:lang w:eastAsia="ru-RU"/>
+          <w14:ligatures w14:val="standardContextual"/>
+        </w:rPr>
+        <w:t xml:space="preserve">                                                                             </w:t>
       </w:r>
       <w:r>
-        <w:t>)</w:t>
+        <w:rPr>
+          <w:rFonts w:eastAsia="Times New Roman" w:cs="Times New Roman"/>
+          <w:color w:val="000000"/>
+          <w:spacing w:val="-10"/>
+          <w:kern w:val="2"/>
+          <w:szCs w:val="28"/>
+          <w:lang w:eastAsia="ru-RU"/>
+          <w14:ligatures w14:val="standardContextual"/>
+        </w:rPr>
+        <w:t>Выполнил:</w:t>
+      </w:r>
+    </w:p>
+    <w:p>
+      <w:pPr>
+        <w:shd w:val="clear" w:color="auto" w:fill="FFFFFF"/>
+        <w:tabs>
+          <w:tab w:val="left" w:pos="3600"/>
+          <w:tab w:val="left" w:pos="5940"/>
+        </w:tabs>
+        <w:jc w:val="both"/>
+        <w:rPr>
+          <w:rFonts w:eastAsia="Times New Roman" w:cs="Times New Roman"/>
+          <w:color w:val="000000"/>
+          <w:kern w:val="2"/>
+          <w:szCs w:val="28"/>
+          <w:lang w:eastAsia="ru-RU"/>
+          <w14:ligatures w14:val="standardContextual"/>
+        </w:rPr>
+      </w:pPr>
+      <w:r>
+        <w:rPr>
+          <w:rFonts w:eastAsia="Times New Roman" w:cs="Times New Roman"/>
+          <w:color w:val="000000"/>
+          <w:spacing w:val="-11"/>
+          <w:kern w:val="2"/>
+          <w:szCs w:val="28"/>
+          <w:lang w:eastAsia="ru-RU"/>
+          <w14:ligatures w14:val="standardContextual"/>
+        </w:rPr>
+        <w:t xml:space="preserve">                                                                             </w:t>
+      </w:r>
+      <w:r>
+        <w:rPr>
+          <w:rFonts w:eastAsia="Times New Roman" w:cs="Times New Roman"/>
+          <w:color w:val="000000"/>
+          <w:kern w:val="2"/>
+          <w:szCs w:val="28"/>
+          <w:lang w:eastAsia="ru-RU"/>
+          <w14:ligatures w14:val="standardContextual"/>
+        </w:rPr>
+        <w:t>студент гр. 1ПИб-02-2оп-23</w:t>
+      </w:r>
+    </w:p>
+    <w:p>
+      <w:pPr>
+        <w:shd w:val="clear" w:color="auto" w:fill="FFFFFF"/>
+        <w:tabs>
+          <w:tab w:val="left" w:pos="3600"/>
+          <w:tab w:val="left" w:pos="5940"/>
+        </w:tabs>
+        <w:jc w:val="both"/>
+        <w:rPr>
+          <w:rFonts w:eastAsia="Times New Roman" w:cs="Times New Roman"/>
+          <w:color w:val="000000"/>
+          <w:spacing w:val="-11"/>
+          <w:kern w:val="2"/>
+          <w:szCs w:val="28"/>
+          <w:lang w:eastAsia="ru-RU"/>
+          <w14:ligatures w14:val="standardContextual"/>
+        </w:rPr>
+      </w:pPr>
+      <w:r>
+        <w:rPr>
+          <w:rFonts w:eastAsia="Times New Roman" w:cs="Times New Roman"/>
+          <w:color w:val="000000"/>
+          <w:spacing w:val="-11"/>
+          <w:kern w:val="2"/>
+          <w:szCs w:val="28"/>
+          <w:lang w:eastAsia="ru-RU"/>
+          <w14:ligatures w14:val="standardContextual"/>
+        </w:rPr>
+        <w:t xml:space="preserve">                                                                             </w:t>
+      </w:r>
+      <w:r>
+        <w:rPr>
+          <w:rFonts w:eastAsia="Times New Roman" w:cs="Times New Roman"/>
+          <w:color w:val="000000"/>
+          <w:kern w:val="2"/>
+          <w:szCs w:val="28"/>
+          <w:lang w:eastAsia="ru-RU"/>
+          <w14:ligatures w14:val="standardContextual"/>
+        </w:rPr>
+        <w:t>Кринкин Олег Алексеевич</w:t>
+      </w:r>
+    </w:p>
+    <w:p>
+      <w:pPr>
+        <w:shd w:val="clear" w:color="auto" w:fill="FFFFFF"/>
+        <w:tabs>
+          <w:tab w:val="left" w:pos="3600"/>
+          <w:tab w:val="left" w:pos="5940"/>
+        </w:tabs>
+        <w:jc w:val="both"/>
+        <w:rPr>
+          <w:rFonts w:eastAsia="Times New Roman" w:cs="Times New Roman"/>
+          <w:color w:val="000000"/>
+          <w:spacing w:val="-11"/>
+          <w:kern w:val="2"/>
+          <w:szCs w:val="28"/>
+          <w:lang w:eastAsia="ru-RU"/>
+          <w14:ligatures w14:val="standardContextual"/>
+        </w:rPr>
+      </w:pPr>
+      <w:r>
+        <w:rPr>
+          <w:rFonts w:eastAsia="Times New Roman" w:cs="Times New Roman"/>
+          <w:color w:val="000000"/>
+          <w:spacing w:val="-11"/>
+          <w:kern w:val="2"/>
+          <w:szCs w:val="28"/>
+          <w:lang w:eastAsia="ru-RU"/>
+          <w14:ligatures w14:val="standardContextual"/>
+        </w:rPr>
+        <w:t xml:space="preserve">                                                                             Проверил: </w:t>
+      </w:r>
+    </w:p>
+    <w:p>
+      <w:pPr>
+        <w:shd w:val="clear" w:color="auto" w:fill="FFFFFF"/>
+        <w:tabs>
+          <w:tab w:val="left" w:pos="3600"/>
+          <w:tab w:val="left" w:pos="5940"/>
+        </w:tabs>
+        <w:jc w:val="center"/>
+        <w:rPr>
+          <w:rFonts w:eastAsia="Times New Roman" w:cs="Times New Roman"/>
+          <w:kern w:val="2"/>
+          <w:szCs w:val="28"/>
+          <w:lang w:eastAsia="ru-RU"/>
+          <w14:ligatures w14:val="standardContextual"/>
+        </w:rPr>
+      </w:pPr>
+      <w:r>
+        <w:rPr>
+          <w:rFonts w:eastAsia="Times New Roman" w:cs="Times New Roman"/>
+          <w:color w:val="000000"/>
+          <w:spacing w:val="-11"/>
+          <w:kern w:val="2"/>
+          <w:szCs w:val="28"/>
+          <w:lang w:eastAsia="ru-RU"/>
+          <w14:ligatures w14:val="standardContextual"/>
+        </w:rPr>
+        <w:t xml:space="preserve">                                                      </w:t>
+      </w:r>
+      <w:r>
+        <w:rPr>
+          <w:rFonts w:eastAsia="Times New Roman" w:cs="Times New Roman"/>
+          <w:color w:val="000000"/>
+          <w:spacing w:val="-11"/>
+          <w:kern w:val="2"/>
+          <w:szCs w:val="28"/>
+          <w:lang w:eastAsia="ru-RU"/>
+          <w14:ligatures w14:val="standardContextual"/>
+        </w:rPr>
+        <w:t xml:space="preserve">                       доцент, к.т.н. Селяничев Олег Леонидович</w:t>
+      </w:r>
+    </w:p>
+    <w:p>
+      <w:pPr>
+        <w:shd w:val="clear" w:color="auto" w:fill="FFFFFF"/>
+        <w:jc w:val="center"/>
+        <w:rPr>
+          <w:rFonts w:eastAsia="Times New Roman" w:cs="Times New Roman"/>
+          <w:color w:val="000000"/>
+          <w:spacing w:val="-10"/>
+          <w:kern w:val="2"/>
+          <w:sz w:val="24"/>
+          <w:szCs w:val="24"/>
+          <w:lang w:eastAsia="ru-RU"/>
+          <w14:ligatures w14:val="standardContextual"/>
+        </w:rPr>
+      </w:pPr>
+    </w:p>
+    <w:p>
+      <w:pPr>
+        <w:shd w:val="clear" w:color="auto" w:fill="FFFFFF"/>
+        <w:spacing w:line="276" w:lineRule="auto"/>
+        <w:jc w:val="center"/>
+        <w:rPr>
+          <w:rFonts w:eastAsia="Times New Roman" w:cs="Times New Roman"/>
+          <w:color w:val="000000"/>
+          <w:kern w:val="2"/>
+          <w:sz w:val="24"/>
+          <w:szCs w:val="24"/>
+          <w:lang w:eastAsia="ru-RU"/>
+          <w14:ligatures w14:val="standardContextual"/>
+        </w:rPr>
+      </w:pPr>
+    </w:p>
+    <w:p>
+      <w:pPr>
+        <w:shd w:val="clear" w:color="auto" w:fill="FFFFFF"/>
+        <w:jc w:val="center"/>
+        <w:rPr>
+          <w:rFonts w:eastAsia="Times New Roman" w:cs="Times New Roman"/>
+          <w:color w:val="000000"/>
+          <w:kern w:val="2"/>
+          <w:sz w:val="24"/>
+          <w:szCs w:val="24"/>
+          <w:lang w:eastAsia="ru-RU"/>
+          <w14:ligatures w14:val="standardContextual"/>
+        </w:rPr>
+      </w:pPr>
+    </w:p>
+    <w:p>
+      <w:pPr>
+        <w:shd w:val="clear" w:color="auto" w:fill="FFFFFF"/>
+        <w:jc w:val="center"/>
+        <w:rPr>
+          <w:rFonts w:eastAsia="Times New Roman" w:cs="Times New Roman"/>
+          <w:color w:val="000000"/>
+          <w:kern w:val="2"/>
+          <w:sz w:val="24"/>
+          <w:szCs w:val="24"/>
+          <w:lang w:eastAsia="ru-RU"/>
+          <w14:ligatures w14:val="standardContextual"/>
+        </w:rPr>
+      </w:pPr>
+    </w:p>
+    <w:p>
+      <w:pPr>
+        <w:shd w:val="clear" w:color="auto" w:fill="FFFFFF"/>
+        <w:jc w:val="center"/>
+        <w:rPr>
+          <w:rFonts w:eastAsia="Times New Roman" w:cs="Times New Roman"/>
+          <w:color w:val="000000"/>
+          <w:kern w:val="2"/>
+          <w:sz w:val="24"/>
+          <w:szCs w:val="24"/>
+          <w:lang w:eastAsia="ru-RU"/>
+          <w14:ligatures w14:val="standardContextual"/>
+        </w:rPr>
+      </w:pPr>
+    </w:p>
+    <w:p>
+      <w:pPr>
+        <w:shd w:val="clear" w:color="auto" w:fill="FFFFFF"/>
+        <w:jc w:val="center"/>
+        <w:rPr>
+          <w:rFonts w:eastAsia="Times New Roman" w:cs="Times New Roman"/>
+          <w:color w:val="000000"/>
+          <w:kern w:val="2"/>
+          <w:sz w:val="24"/>
+          <w:szCs w:val="24"/>
+          <w:lang w:eastAsia="ru-RU"/>
+          <w14:ligatures w14:val="standardContextual"/>
+        </w:rPr>
+      </w:pPr>
+    </w:p>
+    <w:p>
+      <w:pPr>
+        <w:shd w:val="clear" w:color="auto" w:fill="FFFFFF"/>
+        <w:jc w:val="center"/>
+        <w:rPr>
+          <w:rFonts w:eastAsia="Times New Roman" w:cs="Times New Roman"/>
+          <w:color w:val="000000"/>
+          <w:kern w:val="2"/>
+          <w:sz w:val="24"/>
+          <w:szCs w:val="24"/>
+          <w:lang w:eastAsia="ru-RU"/>
+          <w14:ligatures w14:val="standardContextual"/>
+        </w:rPr>
+      </w:pPr>
+    </w:p>
+    <w:p>
+      <w:pPr>
+        <w:spacing w:after="160" w:line="278" w:lineRule="auto"/>
+        <w:ind w:firstLine="0"/>
+        <w:rPr>
+          <w:rFonts w:eastAsia="Aptos" w:cs="Times New Roman"/>
+          <w:kern w:val="2"/>
+          <w:szCs w:val="24"/>
+          <w:lang w:val="en-US"/>
+          <w14:ligatures w14:val="standardContextual"/>
+        </w:rPr>
+      </w:pPr>
+      <w:r>
+        <w:rPr>
+          <w:rFonts w:eastAsia="Aptos" w:cs="Times New Roman"/>
+          <w:kern w:val="2"/>
+          <w:szCs w:val="24"/>
+          <w14:ligatures w14:val="standardContextual"/>
+        </w:rPr>
+        <w:br w:type="page"/>
       </w:r>
     </w:p>
     <w:p>
@@ -34,19 +812,11 @@
           <w:lang w:val="en-US" w:eastAsia="ru-RU"/>
         </w:rPr>
       </w:pPr>
-    </w:p>
-    <w:p>
-      <w:pPr>
-        <w:rPr>
-          <w:i/>
-          <w:iCs/>
-          <w:lang w:eastAsia="ru-RU"/>
-        </w:rPr>
-      </w:pPr>
       <w:r>
         <w:rPr>
           <w:lang w:val="en-US" w:eastAsia="ru-RU"/>
         </w:rPr>
+        <w:lastRenderedPageBreak/>
         <w:t xml:space="preserve">SQL (Structured Query Language) - </w:t>
       </w:r>
       <w:r>
@@ -145,7 +915,7 @@
     <w:p>
       <w:pPr>
         <w:rPr>
-          <w:lang w:eastAsia="ru-RU"/>
+          <w:lang w:val="en-US" w:eastAsia="ru-RU"/>
         </w:rPr>
       </w:pPr>
     </w:p>
@@ -189,7 +959,7 @@
     <w:p>
       <w:pPr>
         <w:rPr>
-          <w:lang w:val="en-US" w:eastAsia="ru-RU"/>
+          <w:lang w:eastAsia="ru-RU"/>
         </w:rPr>
       </w:pPr>
       <w:r>
@@ -280,7 +1050,7 @@
     <w:p>
       <w:pPr>
         <w:rPr>
-          <w:lang w:val="en-US" w:eastAsia="ru-RU"/>
+          <w:lang w:eastAsia="ru-RU"/>
         </w:rPr>
       </w:pPr>
     </w:p>
@@ -311,6 +1081,7 @@
       </w:pPr>
       <w:r>
         <w:rPr>
+          <w:noProof/>
           <w:lang w:eastAsia="ru-RU"/>
         </w:rPr>
         <w:drawing>
@@ -329,7 +1100,7 @@
                     <pic:cNvPicPr/>
                   </pic:nvPicPr>
                   <pic:blipFill>
-                    <a:blip r:embed="rId6"/>
+                    <a:blip r:embed="rId8"/>
                     <a:stretch>
                       <a:fillRect/>
                     </a:stretch>
@@ -357,24 +1128,14 @@
       <w:r>
         <w:t xml:space="preserve">Рис. </w:t>
       </w:r>
-      <w:r>
-        <w:fldChar w:fldCharType="begin"/>
-      </w:r>
-      <w:r>
-        <w:instrText xml:space="preserve"> SEQ Рис. \* ARABIC </w:instrText>
-      </w:r>
-      <w:r>
-        <w:fldChar w:fldCharType="separate"/>
-      </w:r>
-      <w:r>
-        <w:rPr>
-          <w:noProof/>
-        </w:rPr>
-        <w:t>1</w:t>
-      </w:r>
-      <w:r>
-        <w:fldChar w:fldCharType="end"/>
-      </w:r>
+      <w:fldSimple w:instr=" SEQ Рис. \* ARABIC ">
+        <w:r>
+          <w:rPr>
+            <w:noProof/>
+          </w:rPr>
+          <w:t>1</w:t>
+        </w:r>
+      </w:fldSimple>
       <w:r>
         <w:t>. Выполнение подключения к файлу</w:t>
       </w:r>
@@ -441,16 +1202,7 @@
                 <w:rFonts w:ascii="Cascadia Mono" w:hAnsi="Cascadia Mono" w:cs="Cascadia Mono"/>
                 <w:sz w:val="20"/>
                 <w:szCs w:val="20"/>
-              </w:rPr>
-            </w:pPr>
-          </w:p>
-          <w:p>
-            <w:pPr>
-              <w:ind w:firstLine="0"/>
-              <w:rPr>
-                <w:rFonts w:ascii="Cascadia Mono" w:hAnsi="Cascadia Mono" w:cs="Cascadia Mono"/>
-                <w:sz w:val="20"/>
-                <w:szCs w:val="20"/>
+                <w:lang w:val="en-US"/>
               </w:rPr>
             </w:pPr>
             <w:r>
@@ -467,6 +1219,7 @@
                 <w:rFonts w:ascii="Cascadia Mono" w:hAnsi="Cascadia Mono" w:cs="Cascadia Mono"/>
                 <w:sz w:val="20"/>
                 <w:szCs w:val="20"/>
+                <w:lang w:val="en-US"/>
               </w:rPr>
               <w:t xml:space="preserve"> </w:t>
             </w:r>
@@ -484,42 +1237,109 @@
                 <w:rFonts w:ascii="Cascadia Mono" w:hAnsi="Cascadia Mono" w:cs="Cascadia Mono"/>
                 <w:sz w:val="20"/>
                 <w:szCs w:val="20"/>
+                <w:lang w:val="en-US"/>
               </w:rPr>
               <w:t xml:space="preserve"> &lt;</w:t>
             </w:r>
-            <w:proofErr w:type="spellStart"/>
-            <w:r>
-              <w:rPr>
-                <w:rFonts w:ascii="Cascadia Mono" w:hAnsi="Cascadia Mono" w:cs="Cascadia Mono"/>
-                <w:sz w:val="20"/>
-                <w:szCs w:val="20"/>
-              </w:rPr>
-              <w:t>имя_таблицы</w:t>
-            </w:r>
-            <w:proofErr w:type="spellEnd"/>
-            <w:r>
-              <w:rPr>
-                <w:rFonts w:ascii="Cascadia Mono" w:hAnsi="Cascadia Mono" w:cs="Cascadia Mono"/>
-                <w:sz w:val="20"/>
-                <w:szCs w:val="20"/>
-              </w:rPr>
-              <w:t>&gt; (&lt;имя_поля_1&gt; &lt;</w:t>
-            </w:r>
-            <w:proofErr w:type="spellStart"/>
-            <w:r>
-              <w:rPr>
-                <w:rFonts w:ascii="Cascadia Mono" w:hAnsi="Cascadia Mono" w:cs="Cascadia Mono"/>
-                <w:sz w:val="20"/>
-                <w:szCs w:val="20"/>
-              </w:rPr>
-              <w:t>тип_данных</w:t>
-            </w:r>
-            <w:proofErr w:type="spellEnd"/>
-            <w:r>
-              <w:rPr>
-                <w:rFonts w:ascii="Cascadia Mono" w:hAnsi="Cascadia Mono" w:cs="Cascadia Mono"/>
-                <w:sz w:val="20"/>
-                <w:szCs w:val="20"/>
+            <w:r>
+              <w:rPr>
+                <w:rFonts w:ascii="Cascadia Mono" w:hAnsi="Cascadia Mono" w:cs="Cascadia Mono"/>
+                <w:sz w:val="20"/>
+                <w:szCs w:val="20"/>
+              </w:rPr>
+              <w:t>имя</w:t>
+            </w:r>
+            <w:r>
+              <w:rPr>
+                <w:rFonts w:ascii="Cascadia Mono" w:hAnsi="Cascadia Mono" w:cs="Cascadia Mono"/>
+                <w:sz w:val="20"/>
+                <w:szCs w:val="20"/>
+                <w:lang w:val="en-US"/>
+              </w:rPr>
+              <w:t>_</w:t>
+            </w:r>
+            <w:r>
+              <w:rPr>
+                <w:rFonts w:ascii="Cascadia Mono" w:hAnsi="Cascadia Mono" w:cs="Cascadia Mono"/>
+                <w:sz w:val="20"/>
+                <w:szCs w:val="20"/>
+              </w:rPr>
+              <w:t>таблицы</w:t>
+            </w:r>
+            <w:r>
+              <w:rPr>
+                <w:rFonts w:ascii="Cascadia Mono" w:hAnsi="Cascadia Mono" w:cs="Cascadia Mono"/>
+                <w:sz w:val="20"/>
+                <w:szCs w:val="20"/>
+                <w:lang w:val="en-US"/>
+              </w:rPr>
+              <w:t>&gt; (&lt;</w:t>
+            </w:r>
+            <w:r>
+              <w:rPr>
+                <w:rFonts w:ascii="Cascadia Mono" w:hAnsi="Cascadia Mono" w:cs="Cascadia Mono"/>
+                <w:sz w:val="20"/>
+                <w:szCs w:val="20"/>
+              </w:rPr>
+              <w:t>имя</w:t>
+            </w:r>
+            <w:r>
+              <w:rPr>
+                <w:rFonts w:ascii="Cascadia Mono" w:hAnsi="Cascadia Mono" w:cs="Cascadia Mono"/>
+                <w:sz w:val="20"/>
+                <w:szCs w:val="20"/>
+                <w:lang w:val="en-US"/>
+              </w:rPr>
+              <w:t>_</w:t>
+            </w:r>
+            <w:r>
+              <w:rPr>
+                <w:rFonts w:ascii="Cascadia Mono" w:hAnsi="Cascadia Mono" w:cs="Cascadia Mono"/>
+                <w:sz w:val="20"/>
+                <w:szCs w:val="20"/>
+              </w:rPr>
+              <w:t>поля</w:t>
+            </w:r>
+            <w:r>
+              <w:rPr>
+                <w:rFonts w:ascii="Cascadia Mono" w:hAnsi="Cascadia Mono" w:cs="Cascadia Mono"/>
+                <w:sz w:val="20"/>
+                <w:szCs w:val="20"/>
+                <w:lang w:val="en-US"/>
+              </w:rPr>
+              <w:t>_1&gt; &lt;</w:t>
+            </w:r>
+            <w:r>
+              <w:rPr>
+                <w:rFonts w:ascii="Cascadia Mono" w:hAnsi="Cascadia Mono" w:cs="Cascadia Mono"/>
+                <w:sz w:val="20"/>
+                <w:szCs w:val="20"/>
+              </w:rPr>
+              <w:t>тип</w:t>
+            </w:r>
+            <w:r>
+              <w:rPr>
+                <w:rFonts w:ascii="Cascadia Mono" w:hAnsi="Cascadia Mono" w:cs="Cascadia Mono"/>
+                <w:sz w:val="20"/>
+                <w:szCs w:val="20"/>
+                <w:lang w:val="en-US"/>
+              </w:rPr>
+              <w:t>_</w:t>
+            </w:r>
+            <w:r>
+              <w:rPr>
+                <w:rFonts w:ascii="Cascadia Mono" w:hAnsi="Cascadia Mono" w:cs="Cascadia Mono"/>
+                <w:sz w:val="20"/>
+                <w:szCs w:val="20"/>
+              </w:rPr>
+              <w:t>данных</w:t>
+            </w:r>
+            <w:r>
+              <w:rPr>
+                <w:rFonts w:ascii="Cascadia Mono" w:hAnsi="Cascadia Mono" w:cs="Cascadia Mono"/>
+                <w:sz w:val="20"/>
+                <w:szCs w:val="20"/>
+                <w:lang w:val="en-US"/>
               </w:rPr>
               <w:t>&gt; [</w:t>
             </w:r>
@@ -537,6 +1357,7 @@
                 <w:rFonts w:ascii="Cascadia Mono" w:hAnsi="Cascadia Mono" w:cs="Cascadia Mono"/>
                 <w:sz w:val="20"/>
                 <w:szCs w:val="20"/>
+                <w:lang w:val="en-US"/>
               </w:rPr>
               <w:t>|</w:t>
             </w:r>
@@ -554,6 +1375,7 @@
                 <w:rFonts w:ascii="Cascadia Mono" w:hAnsi="Cascadia Mono" w:cs="Cascadia Mono"/>
                 <w:sz w:val="20"/>
                 <w:szCs w:val="20"/>
+                <w:lang w:val="en-US"/>
               </w:rPr>
               <w:t xml:space="preserve"> </w:t>
             </w:r>
@@ -571,24 +1393,24 @@
                 <w:rFonts w:ascii="Cascadia Mono" w:hAnsi="Cascadia Mono" w:cs="Cascadia Mono"/>
                 <w:sz w:val="20"/>
                 <w:szCs w:val="20"/>
+                <w:lang w:val="en-US"/>
               </w:rPr>
               <w:t>], ..., &lt;</w:t>
             </w:r>
-            <w:proofErr w:type="spellStart"/>
-            <w:r>
-              <w:rPr>
-                <w:rFonts w:ascii="Cascadia Mono" w:hAnsi="Cascadia Mono" w:cs="Cascadia Mono"/>
-                <w:sz w:val="20"/>
-                <w:szCs w:val="20"/>
-              </w:rPr>
-              <w:t>имя_поля</w:t>
-            </w:r>
-            <w:proofErr w:type="spellEnd"/>
-            <w:r>
-              <w:rPr>
-                <w:rFonts w:ascii="Cascadia Mono" w:hAnsi="Cascadia Mono" w:cs="Cascadia Mono"/>
-                <w:sz w:val="20"/>
-                <w:szCs w:val="20"/>
+            <w:r>
+              <w:rPr>
+                <w:rFonts w:ascii="Cascadia Mono" w:hAnsi="Cascadia Mono" w:cs="Cascadia Mono"/>
+                <w:sz w:val="20"/>
+                <w:szCs w:val="20"/>
+              </w:rPr>
+              <w:t>имя</w:t>
+            </w:r>
+            <w:r>
+              <w:rPr>
+                <w:rFonts w:ascii="Cascadia Mono" w:hAnsi="Cascadia Mono" w:cs="Cascadia Mono"/>
+                <w:sz w:val="20"/>
+                <w:szCs w:val="20"/>
+                <w:lang w:val="en-US"/>
               </w:rPr>
               <w:t>_</w:t>
             </w:r>
@@ -597,6 +1419,23 @@
                 <w:rFonts w:ascii="Cascadia Mono" w:hAnsi="Cascadia Mono" w:cs="Cascadia Mono"/>
                 <w:sz w:val="20"/>
                 <w:szCs w:val="20"/>
+              </w:rPr>
+              <w:t>поля</w:t>
+            </w:r>
+            <w:r>
+              <w:rPr>
+                <w:rFonts w:ascii="Cascadia Mono" w:hAnsi="Cascadia Mono" w:cs="Cascadia Mono"/>
+                <w:sz w:val="20"/>
+                <w:szCs w:val="20"/>
+                <w:lang w:val="en-US"/>
+              </w:rPr>
+              <w:t>_</w:t>
+            </w:r>
+            <w:r>
+              <w:rPr>
+                <w:rFonts w:ascii="Cascadia Mono" w:hAnsi="Cascadia Mono" w:cs="Cascadia Mono"/>
+                <w:sz w:val="20"/>
+                <w:szCs w:val="20"/>
                 <w:lang w:val="en-US"/>
               </w:rPr>
               <w:t>n</w:t>
@@ -606,24 +1445,41 @@
                 <w:rFonts w:ascii="Cascadia Mono" w:hAnsi="Cascadia Mono" w:cs="Cascadia Mono"/>
                 <w:sz w:val="20"/>
                 <w:szCs w:val="20"/>
+                <w:lang w:val="en-US"/>
               </w:rPr>
               <w:t>&gt; &lt;</w:t>
             </w:r>
-            <w:proofErr w:type="spellStart"/>
-            <w:r>
-              <w:rPr>
-                <w:rFonts w:ascii="Cascadia Mono" w:hAnsi="Cascadia Mono" w:cs="Cascadia Mono"/>
-                <w:sz w:val="20"/>
-                <w:szCs w:val="20"/>
-              </w:rPr>
-              <w:t>тип_данных</w:t>
-            </w:r>
-            <w:proofErr w:type="spellEnd"/>
-            <w:r>
-              <w:rPr>
-                <w:rFonts w:ascii="Cascadia Mono" w:hAnsi="Cascadia Mono" w:cs="Cascadia Mono"/>
-                <w:sz w:val="20"/>
-                <w:szCs w:val="20"/>
+            <w:r>
+              <w:rPr>
+                <w:rFonts w:ascii="Cascadia Mono" w:hAnsi="Cascadia Mono" w:cs="Cascadia Mono"/>
+                <w:sz w:val="20"/>
+                <w:szCs w:val="20"/>
+              </w:rPr>
+              <w:t>тип</w:t>
+            </w:r>
+            <w:r>
+              <w:rPr>
+                <w:rFonts w:ascii="Cascadia Mono" w:hAnsi="Cascadia Mono" w:cs="Cascadia Mono"/>
+                <w:sz w:val="20"/>
+                <w:szCs w:val="20"/>
+                <w:lang w:val="en-US"/>
+              </w:rPr>
+              <w:t>_</w:t>
+            </w:r>
+            <w:r>
+              <w:rPr>
+                <w:rFonts w:ascii="Cascadia Mono" w:hAnsi="Cascadia Mono" w:cs="Cascadia Mono"/>
+                <w:sz w:val="20"/>
+                <w:szCs w:val="20"/>
+              </w:rPr>
+              <w:t>данных</w:t>
+            </w:r>
+            <w:r>
+              <w:rPr>
+                <w:rFonts w:ascii="Cascadia Mono" w:hAnsi="Cascadia Mono" w:cs="Cascadia Mono"/>
+                <w:sz w:val="20"/>
+                <w:szCs w:val="20"/>
+                <w:lang w:val="en-US"/>
               </w:rPr>
               <w:t>&gt; [</w:t>
             </w:r>
@@ -641,6 +1497,7 @@
                 <w:rFonts w:ascii="Cascadia Mono" w:hAnsi="Cascadia Mono" w:cs="Cascadia Mono"/>
                 <w:sz w:val="20"/>
                 <w:szCs w:val="20"/>
+                <w:lang w:val="en-US"/>
               </w:rPr>
               <w:t>|</w:t>
             </w:r>
@@ -658,6 +1515,7 @@
                 <w:rFonts w:ascii="Cascadia Mono" w:hAnsi="Cascadia Mono" w:cs="Cascadia Mono"/>
                 <w:sz w:val="20"/>
                 <w:szCs w:val="20"/>
+                <w:lang w:val="en-US"/>
               </w:rPr>
               <w:t xml:space="preserve"> </w:t>
             </w:r>
@@ -675,35 +1533,38 @@
                 <w:rFonts w:ascii="Cascadia Mono" w:hAnsi="Cascadia Mono" w:cs="Cascadia Mono"/>
                 <w:sz w:val="20"/>
                 <w:szCs w:val="20"/>
+                <w:lang w:val="en-US"/>
               </w:rPr>
               <w:t>]);</w:t>
             </w:r>
-          </w:p>
-          <w:p>
-            <w:pPr>
-              <w:ind w:firstLine="0"/>
-              <w:rPr>
-                <w:rFonts w:ascii="Cascadia Mono" w:hAnsi="Cascadia Mono" w:cs="Cascadia Mono"/>
-                <w:sz w:val="20"/>
-                <w:szCs w:val="20"/>
-              </w:rPr>
-            </w:pPr>
           </w:p>
         </w:tc>
       </w:tr>
     </w:tbl>
-    <w:p/>
-    <w:p/>
-    <w:p/>
-    <w:p/>
-    <w:p/>
     <w:p>
+      <w:pPr>
+        <w:rPr>
+          <w:lang w:val="en-US"/>
+        </w:rPr>
+      </w:pPr>
+    </w:p>
+    <w:p>
+      <w:pPr>
+        <w:rPr>
+          <w:lang w:val="en-US"/>
+        </w:rPr>
+      </w:pPr>
       <w:r>
-        <w:lastRenderedPageBreak/>
         <w:t>Команда для создания таблицы Блюда выглядела следующим образом:</w:t>
       </w:r>
     </w:p>
-    <w:p/>
+    <w:p>
+      <w:pPr>
+        <w:rPr>
+          <w:lang w:val="en-US"/>
+        </w:rPr>
+      </w:pPr>
+    </w:p>
     <w:tbl>
       <w:tblPr>
         <w:tblStyle w:val="a6"/>
@@ -972,9 +1833,9 @@
         </w:tc>
       </w:tr>
     </w:tbl>
-    <w:p/>
     <w:p>
       <w:r>
+        <w:lastRenderedPageBreak/>
         <w:t>Команда для создания таблицы Поставщики выглядела следующим образом:</w:t>
       </w:r>
     </w:p>
@@ -1054,6 +1915,43 @@
                 <w:szCs w:val="20"/>
                 <w:lang w:val="en-US"/>
               </w:rPr>
+              <w:t xml:space="preserve"> (</w:t>
+            </w:r>
+          </w:p>
+          <w:p>
+            <w:pPr>
+              <w:ind w:firstLine="0"/>
+              <w:rPr>
+                <w:rFonts w:ascii="Cascadia Mono" w:hAnsi="Cascadia Mono" w:cs="Cascadia Mono"/>
+                <w:sz w:val="20"/>
+                <w:szCs w:val="20"/>
+                <w:lang w:val="en-US"/>
+              </w:rPr>
+            </w:pPr>
+            <w:r>
+              <w:rPr>
+                <w:rFonts w:ascii="Cascadia Mono" w:hAnsi="Cascadia Mono" w:cs="Cascadia Mono"/>
+                <w:sz w:val="20"/>
+                <w:szCs w:val="20"/>
+                <w:lang w:val="en-US"/>
+              </w:rPr>
+              <w:t xml:space="preserve">   </w:t>
+            </w:r>
+            <w:r>
+              <w:rPr>
+                <w:rFonts w:ascii="Cascadia Mono" w:hAnsi="Cascadia Mono" w:cs="Cascadia Mono"/>
+                <w:sz w:val="20"/>
+                <w:szCs w:val="20"/>
+              </w:rPr>
+              <w:t>ПС</w:t>
+            </w:r>
+            <w:r>
+              <w:rPr>
+                <w:rFonts w:ascii="Cascadia Mono" w:hAnsi="Cascadia Mono" w:cs="Cascadia Mono"/>
+                <w:sz w:val="20"/>
+                <w:szCs w:val="20"/>
+                <w:lang w:val="en-US"/>
+              </w:rPr>
               <w:t xml:space="preserve"> </w:t>
             </w:r>
             <w:r>
@@ -1063,17 +1961,25 @@
                 <w:szCs w:val="20"/>
                 <w:lang w:val="en-US"/>
               </w:rPr>
-              <w:t>(</w:t>
-            </w:r>
-          </w:p>
-          <w:p>
-            <w:pPr>
-              <w:ind w:firstLine="0"/>
-              <w:rPr>
-                <w:rFonts w:ascii="Cascadia Mono" w:hAnsi="Cascadia Mono" w:cs="Cascadia Mono"/>
-                <w:sz w:val="20"/>
-                <w:szCs w:val="20"/>
-                <w:lang w:val="en-US"/>
+              <w:t>SMALLINT</w:t>
+            </w:r>
+            <w:r>
+              <w:rPr>
+                <w:rFonts w:ascii="Cascadia Mono" w:hAnsi="Cascadia Mono" w:cs="Cascadia Mono"/>
+                <w:sz w:val="20"/>
+                <w:szCs w:val="20"/>
+                <w:lang w:val="en-US"/>
+              </w:rPr>
+              <w:t>,</w:t>
+            </w:r>
+          </w:p>
+          <w:p>
+            <w:pPr>
+              <w:ind w:firstLine="0"/>
+              <w:rPr>
+                <w:rFonts w:ascii="Cascadia Mono" w:hAnsi="Cascadia Mono" w:cs="Cascadia Mono"/>
+                <w:sz w:val="20"/>
+                <w:szCs w:val="20"/>
               </w:rPr>
             </w:pPr>
             <w:r>
@@ -1091,14 +1997,13 @@
                 <w:sz w:val="20"/>
                 <w:szCs w:val="20"/>
               </w:rPr>
-              <w:t>ПС</w:t>
-            </w:r>
-            <w:r>
-              <w:rPr>
-                <w:rFonts w:ascii="Cascadia Mono" w:hAnsi="Cascadia Mono" w:cs="Cascadia Mono"/>
-                <w:sz w:val="20"/>
-                <w:szCs w:val="20"/>
-                <w:lang w:val="en-US"/>
+              <w:t>Название</w:t>
+            </w:r>
+            <w:r>
+              <w:rPr>
+                <w:rFonts w:ascii="Cascadia Mono" w:hAnsi="Cascadia Mono" w:cs="Cascadia Mono"/>
+                <w:sz w:val="20"/>
+                <w:szCs w:val="20"/>
               </w:rPr>
               <w:t xml:space="preserve"> </w:t>
             </w:r>
@@ -1109,34 +2014,40 @@
                 <w:szCs w:val="20"/>
                 <w:lang w:val="en-US"/>
               </w:rPr>
-              <w:t>SMALLINT</w:t>
-            </w:r>
-            <w:r>
-              <w:rPr>
-                <w:rFonts w:ascii="Cascadia Mono" w:hAnsi="Cascadia Mono" w:cs="Cascadia Mono"/>
-                <w:sz w:val="20"/>
-                <w:szCs w:val="20"/>
-                <w:lang w:val="en-US"/>
-              </w:rPr>
-              <w:t>,</w:t>
-            </w:r>
-          </w:p>
-          <w:p>
-            <w:pPr>
-              <w:ind w:firstLine="0"/>
-              <w:rPr>
-                <w:rFonts w:ascii="Cascadia Mono" w:hAnsi="Cascadia Mono" w:cs="Cascadia Mono"/>
-                <w:sz w:val="20"/>
-                <w:szCs w:val="20"/>
-                <w:lang w:val="en-US"/>
-              </w:rPr>
-            </w:pPr>
-            <w:r>
-              <w:rPr>
-                <w:rFonts w:ascii="Cascadia Mono" w:hAnsi="Cascadia Mono" w:cs="Cascadia Mono"/>
-                <w:sz w:val="20"/>
-                <w:szCs w:val="20"/>
-                <w:lang w:val="en-US"/>
+              <w:t>C</w:t>
+            </w:r>
+            <w:r>
+              <w:rPr>
+                <w:rFonts w:ascii="Cascadia Mono" w:hAnsi="Cascadia Mono" w:cs="Cascadia Mono"/>
+                <w:sz w:val="20"/>
+                <w:szCs w:val="20"/>
+                <w:lang w:val="en-US"/>
+              </w:rPr>
+              <w:t>HAR</w:t>
+            </w:r>
+            <w:r>
+              <w:rPr>
+                <w:rFonts w:ascii="Cascadia Mono" w:hAnsi="Cascadia Mono" w:cs="Cascadia Mono"/>
+                <w:sz w:val="20"/>
+                <w:szCs w:val="20"/>
+              </w:rPr>
+              <w:t xml:space="preserve"> (30),</w:t>
+            </w:r>
+          </w:p>
+          <w:p>
+            <w:pPr>
+              <w:ind w:firstLine="0"/>
+              <w:rPr>
+                <w:rFonts w:ascii="Cascadia Mono" w:hAnsi="Cascadia Mono" w:cs="Cascadia Mono"/>
+                <w:sz w:val="20"/>
+                <w:szCs w:val="20"/>
+              </w:rPr>
+            </w:pPr>
+            <w:r>
+              <w:rPr>
+                <w:rFonts w:ascii="Cascadia Mono" w:hAnsi="Cascadia Mono" w:cs="Cascadia Mono"/>
+                <w:sz w:val="20"/>
+                <w:szCs w:val="20"/>
               </w:rPr>
               <w:t xml:space="preserve">   </w:t>
             </w:r>
@@ -1146,52 +2057,57 @@
                 <w:sz w:val="20"/>
                 <w:szCs w:val="20"/>
               </w:rPr>
-              <w:t>Название</w:t>
-            </w:r>
-            <w:r>
-              <w:rPr>
-                <w:rFonts w:ascii="Cascadia Mono" w:hAnsi="Cascadia Mono" w:cs="Cascadia Mono"/>
-                <w:sz w:val="20"/>
-                <w:szCs w:val="20"/>
-                <w:lang w:val="en-US"/>
-              </w:rPr>
-              <w:t xml:space="preserve"> C</w:t>
-            </w:r>
-            <w:r>
-              <w:rPr>
-                <w:rFonts w:ascii="Cascadia Mono" w:hAnsi="Cascadia Mono" w:cs="Cascadia Mono"/>
-                <w:sz w:val="20"/>
-                <w:szCs w:val="20"/>
-                <w:lang w:val="en-US"/>
-              </w:rPr>
-              <w:t xml:space="preserve">HAR </w:t>
-            </w:r>
-            <w:r>
-              <w:rPr>
-                <w:rFonts w:ascii="Cascadia Mono" w:hAnsi="Cascadia Mono" w:cs="Cascadia Mono"/>
-                <w:sz w:val="20"/>
-                <w:szCs w:val="20"/>
-                <w:lang w:val="en-US"/>
-              </w:rPr>
-              <w:t>(30),</w:t>
-            </w:r>
-          </w:p>
-          <w:p>
-            <w:pPr>
-              <w:ind w:firstLine="0"/>
-              <w:rPr>
-                <w:rFonts w:ascii="Cascadia Mono" w:hAnsi="Cascadia Mono" w:cs="Cascadia Mono"/>
-                <w:sz w:val="20"/>
-                <w:szCs w:val="20"/>
-                <w:lang w:val="en-US"/>
-              </w:rPr>
-            </w:pPr>
-            <w:r>
-              <w:rPr>
-                <w:rFonts w:ascii="Cascadia Mono" w:hAnsi="Cascadia Mono" w:cs="Cascadia Mono"/>
-                <w:sz w:val="20"/>
-                <w:szCs w:val="20"/>
-                <w:lang w:val="en-US"/>
+              <w:t>Статус</w:t>
+            </w:r>
+            <w:r>
+              <w:rPr>
+                <w:rFonts w:ascii="Cascadia Mono" w:hAnsi="Cascadia Mono" w:cs="Cascadia Mono"/>
+                <w:sz w:val="20"/>
+                <w:szCs w:val="20"/>
+              </w:rPr>
+              <w:t xml:space="preserve"> </w:t>
+            </w:r>
+            <w:r>
+              <w:rPr>
+                <w:rFonts w:ascii="Cascadia Mono" w:hAnsi="Cascadia Mono" w:cs="Cascadia Mono"/>
+                <w:sz w:val="20"/>
+                <w:szCs w:val="20"/>
+                <w:lang w:val="en-US"/>
+              </w:rPr>
+              <w:t>C</w:t>
+            </w:r>
+            <w:r>
+              <w:rPr>
+                <w:rFonts w:ascii="Cascadia Mono" w:hAnsi="Cascadia Mono" w:cs="Cascadia Mono"/>
+                <w:sz w:val="20"/>
+                <w:szCs w:val="20"/>
+                <w:lang w:val="en-US"/>
+              </w:rPr>
+              <w:t>HAR</w:t>
+            </w:r>
+            <w:r>
+              <w:rPr>
+                <w:rFonts w:ascii="Cascadia Mono" w:hAnsi="Cascadia Mono" w:cs="Cascadia Mono"/>
+                <w:sz w:val="20"/>
+                <w:szCs w:val="20"/>
+              </w:rPr>
+              <w:t xml:space="preserve"> (20),</w:t>
+            </w:r>
+          </w:p>
+          <w:p>
+            <w:pPr>
+              <w:ind w:firstLine="0"/>
+              <w:rPr>
+                <w:rFonts w:ascii="Cascadia Mono" w:hAnsi="Cascadia Mono" w:cs="Cascadia Mono"/>
+                <w:sz w:val="20"/>
+                <w:szCs w:val="20"/>
+              </w:rPr>
+            </w:pPr>
+            <w:r>
+              <w:rPr>
+                <w:rFonts w:ascii="Cascadia Mono" w:hAnsi="Cascadia Mono" w:cs="Cascadia Mono"/>
+                <w:sz w:val="20"/>
+                <w:szCs w:val="20"/>
               </w:rPr>
               <w:t xml:space="preserve">   </w:t>
             </w:r>
@@ -1201,61 +2117,6 @@
                 <w:sz w:val="20"/>
                 <w:szCs w:val="20"/>
               </w:rPr>
-              <w:t>Статус</w:t>
-            </w:r>
-            <w:r>
-              <w:rPr>
-                <w:rFonts w:ascii="Cascadia Mono" w:hAnsi="Cascadia Mono" w:cs="Cascadia Mono"/>
-                <w:sz w:val="20"/>
-                <w:szCs w:val="20"/>
-                <w:lang w:val="en-US"/>
-              </w:rPr>
-              <w:t xml:space="preserve"> C</w:t>
-            </w:r>
-            <w:r>
-              <w:rPr>
-                <w:rFonts w:ascii="Cascadia Mono" w:hAnsi="Cascadia Mono" w:cs="Cascadia Mono"/>
-                <w:sz w:val="20"/>
-                <w:szCs w:val="20"/>
-                <w:lang w:val="en-US"/>
-              </w:rPr>
-              <w:t xml:space="preserve">HAR </w:t>
-            </w:r>
-            <w:r>
-              <w:rPr>
-                <w:rFonts w:ascii="Cascadia Mono" w:hAnsi="Cascadia Mono" w:cs="Cascadia Mono"/>
-                <w:sz w:val="20"/>
-                <w:szCs w:val="20"/>
-                <w:lang w:val="en-US"/>
-              </w:rPr>
-              <w:t>(20),</w:t>
-            </w:r>
-          </w:p>
-          <w:p>
-            <w:pPr>
-              <w:ind w:firstLine="0"/>
-              <w:rPr>
-                <w:rFonts w:ascii="Cascadia Mono" w:hAnsi="Cascadia Mono" w:cs="Cascadia Mono"/>
-                <w:sz w:val="20"/>
-                <w:szCs w:val="20"/>
-                <w:lang w:val="en-US"/>
-              </w:rPr>
-            </w:pPr>
-            <w:r>
-              <w:rPr>
-                <w:rFonts w:ascii="Cascadia Mono" w:hAnsi="Cascadia Mono" w:cs="Cascadia Mono"/>
-                <w:sz w:val="20"/>
-                <w:szCs w:val="20"/>
-                <w:lang w:val="en-US"/>
-              </w:rPr>
-              <w:t xml:space="preserve">   </w:t>
-            </w:r>
-            <w:r>
-              <w:rPr>
-                <w:rFonts w:ascii="Cascadia Mono" w:hAnsi="Cascadia Mono" w:cs="Cascadia Mono"/>
-                <w:sz w:val="20"/>
-                <w:szCs w:val="20"/>
-              </w:rPr>
               <w:t>Город</w:t>
             </w:r>
             <w:r>
@@ -1263,45 +2124,51 @@
                 <w:rFonts w:ascii="Cascadia Mono" w:hAnsi="Cascadia Mono" w:cs="Cascadia Mono"/>
                 <w:sz w:val="20"/>
                 <w:szCs w:val="20"/>
-                <w:lang w:val="en-US"/>
-              </w:rPr>
-              <w:t xml:space="preserve"> C</w:t>
-            </w:r>
-            <w:r>
-              <w:rPr>
-                <w:rFonts w:ascii="Cascadia Mono" w:hAnsi="Cascadia Mono" w:cs="Cascadia Mono"/>
-                <w:sz w:val="20"/>
-                <w:szCs w:val="20"/>
-                <w:lang w:val="en-US"/>
-              </w:rPr>
-              <w:t xml:space="preserve">HAR </w:t>
-            </w:r>
-            <w:r>
-              <w:rPr>
-                <w:rFonts w:ascii="Cascadia Mono" w:hAnsi="Cascadia Mono" w:cs="Cascadia Mono"/>
-                <w:sz w:val="20"/>
-                <w:szCs w:val="20"/>
-                <w:lang w:val="en-US"/>
-              </w:rPr>
-              <w:t>(20),</w:t>
-            </w:r>
-          </w:p>
-          <w:p>
-            <w:pPr>
-              <w:ind w:firstLine="0"/>
-              <w:rPr>
-                <w:rFonts w:ascii="Cascadia Mono" w:hAnsi="Cascadia Mono" w:cs="Cascadia Mono"/>
-                <w:sz w:val="20"/>
-                <w:szCs w:val="20"/>
-                <w:lang w:val="en-US"/>
-              </w:rPr>
-            </w:pPr>
-            <w:r>
-              <w:rPr>
-                <w:rFonts w:ascii="Cascadia Mono" w:hAnsi="Cascadia Mono" w:cs="Cascadia Mono"/>
-                <w:sz w:val="20"/>
-                <w:szCs w:val="20"/>
-                <w:lang w:val="en-US"/>
+              </w:rPr>
+              <w:t xml:space="preserve"> </w:t>
+            </w:r>
+            <w:r>
+              <w:rPr>
+                <w:rFonts w:ascii="Cascadia Mono" w:hAnsi="Cascadia Mono" w:cs="Cascadia Mono"/>
+                <w:sz w:val="20"/>
+                <w:szCs w:val="20"/>
+                <w:lang w:val="en-US"/>
+              </w:rPr>
+              <w:t>C</w:t>
+            </w:r>
+            <w:r>
+              <w:rPr>
+                <w:rFonts w:ascii="Cascadia Mono" w:hAnsi="Cascadia Mono" w:cs="Cascadia Mono"/>
+                <w:sz w:val="20"/>
+                <w:szCs w:val="20"/>
+                <w:lang w:val="en-US"/>
+              </w:rPr>
+              <w:t>HAR</w:t>
+            </w:r>
+            <w:r>
+              <w:rPr>
+                <w:rFonts w:ascii="Cascadia Mono" w:hAnsi="Cascadia Mono" w:cs="Cascadia Mono"/>
+                <w:sz w:val="20"/>
+                <w:szCs w:val="20"/>
+              </w:rPr>
+              <w:t xml:space="preserve"> (20),</w:t>
+            </w:r>
+          </w:p>
+          <w:p>
+            <w:pPr>
+              <w:ind w:firstLine="0"/>
+              <w:rPr>
+                <w:rFonts w:ascii="Cascadia Mono" w:hAnsi="Cascadia Mono" w:cs="Cascadia Mono"/>
+                <w:sz w:val="20"/>
+                <w:szCs w:val="20"/>
+                <w:lang w:val="en-US"/>
+              </w:rPr>
+            </w:pPr>
+            <w:r>
+              <w:rPr>
+                <w:rFonts w:ascii="Cascadia Mono" w:hAnsi="Cascadia Mono" w:cs="Cascadia Mono"/>
+                <w:sz w:val="20"/>
+                <w:szCs w:val="20"/>
               </w:rPr>
               <w:t xml:space="preserve">   </w:t>
             </w:r>
@@ -1956,7 +2823,6 @@
     </w:p>
     <w:p>
       <w:r>
-        <w:lastRenderedPageBreak/>
         <w:t xml:space="preserve">Команда для создания таблицы </w:t>
       </w:r>
       <w:r>
@@ -1988,6 +2854,7 @@
                 <w:rFonts w:ascii="Cascadia Mono" w:hAnsi="Cascadia Mono" w:cs="Cascadia Mono"/>
                 <w:sz w:val="20"/>
                 <w:szCs w:val="20"/>
+                <w:lang w:val="en-US"/>
               </w:rPr>
             </w:pPr>
             <w:r>
@@ -2085,9 +2952,37 @@
         </w:tc>
       </w:tr>
     </w:tbl>
-    <w:p/>
+    <w:p>
+      <w:pPr>
+        <w:rPr>
+          <w:lang w:val="en-US"/>
+        </w:rPr>
+      </w:pPr>
+    </w:p>
+    <w:p>
+      <w:pPr>
+        <w:rPr>
+          <w:lang w:val="en-US"/>
+        </w:rPr>
+      </w:pPr>
+    </w:p>
+    <w:p>
+      <w:pPr>
+        <w:rPr>
+          <w:lang w:val="en-US"/>
+        </w:rPr>
+      </w:pPr>
+    </w:p>
+    <w:p>
+      <w:pPr>
+        <w:rPr>
+          <w:lang w:val="en-US"/>
+        </w:rPr>
+      </w:pPr>
+    </w:p>
     <w:p>
       <w:r>
+        <w:lastRenderedPageBreak/>
         <w:t xml:space="preserve">Команда для создания таблицы </w:t>
       </w:r>
       <w:r>
@@ -2982,13 +3877,15 @@
         </w:tc>
       </w:tr>
     </w:tbl>
-    <w:p/>
-    <w:p/>
-    <w:p/>
-    <w:p/>
+    <w:p>
+      <w:pPr>
+        <w:rPr>
+          <w:lang w:val="en-US"/>
+        </w:rPr>
+      </w:pPr>
+    </w:p>
     <w:p>
       <w:r>
-        <w:lastRenderedPageBreak/>
         <w:t xml:space="preserve">Команда для создания таблицы </w:t>
       </w:r>
       <w:r>
@@ -3133,9 +4030,30 @@
         </w:tc>
       </w:tr>
     </w:tbl>
-    <w:p/>
+    <w:p>
+      <w:pPr>
+        <w:rPr>
+          <w:lang w:val="en-US"/>
+        </w:rPr>
+      </w:pPr>
+    </w:p>
+    <w:p>
+      <w:pPr>
+        <w:rPr>
+          <w:lang w:val="en-US"/>
+        </w:rPr>
+      </w:pPr>
+    </w:p>
+    <w:p>
+      <w:pPr>
+        <w:rPr>
+          <w:lang w:val="en-US"/>
+        </w:rPr>
+      </w:pPr>
+    </w:p>
     <w:p>
       <w:r>
+        <w:lastRenderedPageBreak/>
         <w:t xml:space="preserve">Команда для создания таблицы </w:t>
       </w:r>
       <w:r>
@@ -3517,7 +4435,7 @@
                     <pic:cNvPicPr/>
                   </pic:nvPicPr>
                   <pic:blipFill>
-                    <a:blip r:embed="rId7">
+                    <a:blip r:embed="rId9">
                       <a:extLst>
                         <a:ext uri="{28A0092B-C50C-407E-A947-70E740481C1C}">
                           <a14:useLocalDpi xmlns:a14="http://schemas.microsoft.com/office/drawing/2010/main" val="0"/>
@@ -3551,24 +4469,14 @@
       <w:r>
         <w:t xml:space="preserve">Рис. </w:t>
       </w:r>
-      <w:r>
-        <w:fldChar w:fldCharType="begin"/>
-      </w:r>
-      <w:r>
-        <w:instrText xml:space="preserve"> SEQ Рис. \* ARABIC </w:instrText>
-      </w:r>
-      <w:r>
-        <w:fldChar w:fldCharType="separate"/>
-      </w:r>
-      <w:r>
-        <w:rPr>
-          <w:noProof/>
-        </w:rPr>
-        <w:t>2</w:t>
-      </w:r>
-      <w:r>
-        <w:fldChar w:fldCharType="end"/>
-      </w:r>
+      <w:fldSimple w:instr=" SEQ Рис. \* ARABIC ">
+        <w:r>
+          <w:rPr>
+            <w:noProof/>
+          </w:rPr>
+          <w:t>2</w:t>
+        </w:r>
+      </w:fldSimple>
       <w:r>
         <w:t>. Выделение и копирование значений</w:t>
       </w:r>
@@ -3610,7 +4518,7 @@
           <w:noProof/>
         </w:rPr>
         <w:drawing>
-          <wp:inline distT="0" distB="0" distL="0" distR="0" wp14:anchorId="5473D1F8" wp14:editId="7E66C311">
+          <wp:inline distT="0" distB="0" distL="0" distR="0" wp14:anchorId="5473D1F8" wp14:editId="04BBD351">
             <wp:extent cx="2348203" cy="622415"/>
             <wp:effectExtent l="0" t="0" r="1905" b="0"/>
             <wp:docPr id="1787034235" name="Рисунок 2" descr="Изображение выглядит как текст, снимок экрана, Шрифт&#10;&#10;Содержимое, созданное искусственным интеллектом, может быть неверным."/>
@@ -3625,7 +4533,7 @@
                     <pic:cNvPicPr/>
                   </pic:nvPicPr>
                   <pic:blipFill>
-                    <a:blip r:embed="rId8" cstate="print">
+                    <a:blip r:embed="rId10" cstate="print">
                       <a:extLst>
                         <a:ext uri="{28A0092B-C50C-407E-A947-70E740481C1C}">
                           <a14:useLocalDpi xmlns:a14="http://schemas.microsoft.com/office/drawing/2010/main" val="0"/>
@@ -3659,24 +4567,14 @@
       <w:r>
         <w:t xml:space="preserve">Рис. </w:t>
       </w:r>
-      <w:r>
-        <w:fldChar w:fldCharType="begin"/>
-      </w:r>
-      <w:r>
-        <w:instrText xml:space="preserve"> SEQ Рис. \* ARABIC </w:instrText>
-      </w:r>
-      <w:r>
-        <w:fldChar w:fldCharType="separate"/>
-      </w:r>
-      <w:r>
-        <w:rPr>
-          <w:noProof/>
-        </w:rPr>
-        <w:t>3</w:t>
-      </w:r>
-      <w:r>
-        <w:fldChar w:fldCharType="end"/>
-      </w:r>
+      <w:fldSimple w:instr=" SEQ Рис. \* ARABIC ">
+        <w:r>
+          <w:rPr>
+            <w:noProof/>
+          </w:rPr>
+          <w:t>3</w:t>
+        </w:r>
+      </w:fldSimple>
       <w:r>
         <w:t>. Выделение полей</w:t>
       </w:r>
@@ -3684,7 +4582,6 @@
     <w:p/>
     <w:p>
       <w:r>
-        <w:lastRenderedPageBreak/>
         <w:t>Затем происходит вставка значений</w:t>
       </w:r>
       <w:r>
@@ -3702,7 +4599,7 @@
           <w:noProof/>
         </w:rPr>
         <w:drawing>
-          <wp:inline distT="0" distB="0" distL="0" distR="0" wp14:anchorId="7821A5ED" wp14:editId="655D90DA">
+          <wp:inline distT="0" distB="0" distL="0" distR="0" wp14:anchorId="7821A5ED" wp14:editId="24AFBB94">
             <wp:extent cx="2262167" cy="1214352"/>
             <wp:effectExtent l="0" t="0" r="0" b="5080"/>
             <wp:docPr id="1301555754" name="Рисунок 3" descr="Изображение выглядит как текст, снимок экрана, Шрифт, число&#10;&#10;Содержимое, созданное искусственным интеллектом, может быть неверным."/>
@@ -3717,7 +4614,7 @@
                     <pic:cNvPicPr/>
                   </pic:nvPicPr>
                   <pic:blipFill>
-                    <a:blip r:embed="rId9" cstate="print">
+                    <a:blip r:embed="rId11" cstate="print">
                       <a:extLst>
                         <a:ext uri="{28A0092B-C50C-407E-A947-70E740481C1C}">
                           <a14:useLocalDpi xmlns:a14="http://schemas.microsoft.com/office/drawing/2010/main" val="0"/>
@@ -3751,30 +4648,21 @@
       <w:r>
         <w:t xml:space="preserve">Рис. </w:t>
       </w:r>
-      <w:r>
-        <w:fldChar w:fldCharType="begin"/>
-      </w:r>
-      <w:r>
-        <w:instrText xml:space="preserve"> SEQ Рис. \* ARABIC </w:instrText>
-      </w:r>
-      <w:r>
-        <w:fldChar w:fldCharType="separate"/>
-      </w:r>
-      <w:r>
-        <w:rPr>
-          <w:noProof/>
-        </w:rPr>
-        <w:t>4</w:t>
-      </w:r>
-      <w:r>
-        <w:fldChar w:fldCharType="end"/>
-      </w:r>
+      <w:fldSimple w:instr=" SEQ Рис. \* ARABIC ">
+        <w:r>
+          <w:rPr>
+            <w:noProof/>
+          </w:rPr>
+          <w:t>4</w:t>
+        </w:r>
+      </w:fldSimple>
       <w:r>
         <w:t>. Вставка значений</w:t>
       </w:r>
     </w:p>
     <w:p>
       <w:r>
+        <w:lastRenderedPageBreak/>
         <w:t xml:space="preserve">Некоторые из таблиц разделены на несколько частей, (пример – таблица Состав (рис. 5)), поэтому их значения сначала были вставлены в </w:t>
       </w:r>
       <w:r>
@@ -3825,9 +4713,9 @@
           <w:noProof/>
         </w:rPr>
         <w:drawing>
-          <wp:inline distT="0" distB="0" distL="0" distR="0" wp14:anchorId="2225BCD6" wp14:editId="4DAF978B">
-            <wp:extent cx="1858587" cy="4984636"/>
-            <wp:effectExtent l="0" t="0" r="0" b="0"/>
+          <wp:inline distT="0" distB="0" distL="0" distR="0" wp14:anchorId="2225BCD6" wp14:editId="74C8FC80">
+            <wp:extent cx="1924493" cy="5161392"/>
+            <wp:effectExtent l="0" t="0" r="6350" b="0"/>
             <wp:docPr id="1733428803" name="Рисунок 4"/>
             <wp:cNvGraphicFramePr>
               <a:graphicFrameLocks xmlns:a="http://schemas.openxmlformats.org/drawingml/2006/main" noChangeAspect="1"/>
@@ -3840,7 +4728,7 @@
                     <pic:cNvPicPr/>
                   </pic:nvPicPr>
                   <pic:blipFill>
-                    <a:blip r:embed="rId10" cstate="print">
+                    <a:blip r:embed="rId12" cstate="print">
                       <a:extLst>
                         <a:ext uri="{28A0092B-C50C-407E-A947-70E740481C1C}">
                           <a14:useLocalDpi xmlns:a14="http://schemas.microsoft.com/office/drawing/2010/main" val="0"/>
@@ -3854,7 +4742,7 @@
                   <pic:spPr>
                     <a:xfrm>
                       <a:off x="0" y="0"/>
-                      <a:ext cx="1877158" cy="5034442"/>
+                      <a:ext cx="1963010" cy="5264692"/>
                     </a:xfrm>
                     <a:prstGeom prst="rect">
                       <a:avLst/>
@@ -3874,24 +4762,14 @@
       <w:r>
         <w:t xml:space="preserve">Рис. </w:t>
       </w:r>
-      <w:r>
-        <w:fldChar w:fldCharType="begin"/>
-      </w:r>
-      <w:r>
-        <w:instrText xml:space="preserve"> SEQ Рис. \* ARABIC </w:instrText>
-      </w:r>
-      <w:r>
-        <w:fldChar w:fldCharType="separate"/>
-      </w:r>
-      <w:r>
-        <w:rPr>
-          <w:noProof/>
-        </w:rPr>
-        <w:t>5</w:t>
-      </w:r>
-      <w:r>
-        <w:fldChar w:fldCharType="end"/>
-      </w:r>
+      <w:fldSimple w:instr=" SEQ Рис. \* ARABIC ">
+        <w:r>
+          <w:rPr>
+            <w:noProof/>
+          </w:rPr>
+          <w:t>5</w:t>
+        </w:r>
+      </w:fldSimple>
       <w:r>
         <w:t>. Таблица Состав в учебнике</w:t>
       </w:r>
@@ -3910,9 +4788,8 @@
         <w:rPr>
           <w:noProof/>
         </w:rPr>
-        <w:lastRenderedPageBreak/>
         <w:drawing>
-          <wp:inline distT="0" distB="0" distL="0" distR="0" wp14:anchorId="1B1979EF" wp14:editId="667911DF">
+          <wp:inline distT="0" distB="0" distL="0" distR="0" wp14:anchorId="1B1979EF" wp14:editId="4A9080F3">
             <wp:extent cx="2625914" cy="1499457"/>
             <wp:effectExtent l="0" t="0" r="3175" b="0"/>
             <wp:docPr id="1063861195" name="Рисунок 5"/>
@@ -3927,7 +4804,7 @@
                     <pic:cNvPicPr/>
                   </pic:nvPicPr>
                   <pic:blipFill>
-                    <a:blip r:embed="rId11" cstate="print">
+                    <a:blip r:embed="rId13" cstate="print">
                       <a:extLst>
                         <a:ext uri="{28A0092B-C50C-407E-A947-70E740481C1C}">
                           <a14:useLocalDpi xmlns:a14="http://schemas.microsoft.com/office/drawing/2010/main" val="0"/>
@@ -3961,30 +4838,21 @@
       <w:r>
         <w:t xml:space="preserve">Рис. </w:t>
       </w:r>
-      <w:r>
-        <w:fldChar w:fldCharType="begin"/>
-      </w:r>
-      <w:r>
-        <w:instrText xml:space="preserve"> SEQ Рис. \* ARABIC </w:instrText>
-      </w:r>
-      <w:r>
-        <w:fldChar w:fldCharType="separate"/>
-      </w:r>
-      <w:r>
-        <w:rPr>
-          <w:noProof/>
-        </w:rPr>
-        <w:t>6</w:t>
-      </w:r>
-      <w:r>
-        <w:fldChar w:fldCharType="end"/>
-      </w:r>
+      <w:fldSimple w:instr=" SEQ Рис. \* ARABIC ">
+        <w:r>
+          <w:rPr>
+            <w:noProof/>
+          </w:rPr>
+          <w:t>6</w:t>
+        </w:r>
+      </w:fldSimple>
       <w:r>
         <w:t>. Фрагмент таблицы Блюда из учебника</w:t>
       </w:r>
     </w:p>
     <w:p>
       <w:r>
+        <w:lastRenderedPageBreak/>
         <w:t xml:space="preserve">Внесение данных в </w:t>
       </w:r>
       <w:r>
@@ -4028,7 +4896,7 @@
                     <pic:cNvPicPr/>
                   </pic:nvPicPr>
                   <pic:blipFill>
-                    <a:blip r:embed="rId12">
+                    <a:blip r:embed="rId14">
                       <a:extLst>
                         <a:ext uri="{28A0092B-C50C-407E-A947-70E740481C1C}">
                           <a14:useLocalDpi xmlns:a14="http://schemas.microsoft.com/office/drawing/2010/main" val="0"/>
@@ -4062,24 +4930,14 @@
       <w:r>
         <w:t xml:space="preserve">Рис. </w:t>
       </w:r>
-      <w:r>
-        <w:fldChar w:fldCharType="begin"/>
-      </w:r>
-      <w:r>
-        <w:instrText xml:space="preserve"> SEQ Рис. \* ARABIC </w:instrText>
-      </w:r>
-      <w:r>
-        <w:fldChar w:fldCharType="separate"/>
-      </w:r>
-      <w:r>
-        <w:rPr>
-          <w:noProof/>
-        </w:rPr>
-        <w:t>7</w:t>
-      </w:r>
-      <w:r>
-        <w:fldChar w:fldCharType="end"/>
-      </w:r>
+      <w:fldSimple w:instr=" SEQ Рис. \* ARABIC ">
+        <w:r>
+          <w:rPr>
+            <w:noProof/>
+          </w:rPr>
+          <w:t>7</w:t>
+        </w:r>
+      </w:fldSimple>
       <w:r>
         <w:t>. Содержание текстового файла</w:t>
       </w:r>
@@ -4098,10 +4956,7 @@
         <w:t xml:space="preserve"> </w:t>
       </w:r>
       <w:r>
-        <w:t xml:space="preserve">в разделе Данные был выбран пункт «Получение данных </w:t>
-      </w:r>
-      <w:r>
-        <w:t>→</w:t>
+        <w:t>в разделе Данные был выбран пункт «Получение данных →</w:t>
       </w:r>
       <w:r>
         <w:t xml:space="preserve"> </w:t>
@@ -4121,7 +4976,7 @@
           <w:noProof/>
         </w:rPr>
         <w:drawing>
-          <wp:inline distT="0" distB="0" distL="0" distR="0" wp14:anchorId="531888CD" wp14:editId="122E2513">
+          <wp:inline distT="0" distB="0" distL="0" distR="0" wp14:anchorId="531888CD" wp14:editId="640C6521">
             <wp:extent cx="3692983" cy="1829319"/>
             <wp:effectExtent l="0" t="0" r="3175" b="0"/>
             <wp:docPr id="948486229" name="Рисунок 7"/>
@@ -4136,7 +4991,7 @@
                     <pic:cNvPicPr/>
                   </pic:nvPicPr>
                   <pic:blipFill>
-                    <a:blip r:embed="rId13" cstate="print">
+                    <a:blip r:embed="rId15" cstate="print">
                       <a:extLst>
                         <a:ext uri="{28A0092B-C50C-407E-A947-70E740481C1C}">
                           <a14:useLocalDpi xmlns:a14="http://schemas.microsoft.com/office/drawing/2010/main" val="0"/>
@@ -4170,26 +5025,25 @@
       <w:r>
         <w:t xml:space="preserve">Рис. </w:t>
       </w:r>
-      <w:r>
-        <w:fldChar w:fldCharType="begin"/>
-      </w:r>
-      <w:r>
-        <w:instrText xml:space="preserve"> SEQ Рис. \* ARABIC </w:instrText>
-      </w:r>
-      <w:r>
-        <w:fldChar w:fldCharType="separate"/>
-      </w:r>
-      <w:r>
-        <w:rPr>
-          <w:noProof/>
-        </w:rPr>
-        <w:t>8</w:t>
-      </w:r>
-      <w:r>
-        <w:fldChar w:fldCharType="end"/>
-      </w:r>
+      <w:fldSimple w:instr=" SEQ Рис. \* ARABIC ">
+        <w:r>
+          <w:rPr>
+            <w:noProof/>
+          </w:rPr>
+          <w:t>8</w:t>
+        </w:r>
+      </w:fldSimple>
       <w:r>
         <w:t>. Получение данных из текста</w:t>
+      </w:r>
+    </w:p>
+    <w:p>
+      <w:pPr>
+        <w:spacing w:after="160" w:line="259" w:lineRule="auto"/>
+        <w:ind w:firstLine="0"/>
+      </w:pPr>
+      <w:r>
+        <w:br w:type="page"/>
       </w:r>
     </w:p>
     <w:p>
@@ -4224,7 +5078,7 @@
                     <pic:cNvPicPr/>
                   </pic:nvPicPr>
                   <pic:blipFill>
-                    <a:blip r:embed="rId14" cstate="print">
+                    <a:blip r:embed="rId16" cstate="print">
                       <a:extLst>
                         <a:ext uri="{28A0092B-C50C-407E-A947-70E740481C1C}">
                           <a14:useLocalDpi xmlns:a14="http://schemas.microsoft.com/office/drawing/2010/main" val="0"/>
@@ -4258,24 +5112,14 @@
       <w:r>
         <w:t xml:space="preserve">Рис. </w:t>
       </w:r>
-      <w:r>
-        <w:fldChar w:fldCharType="begin"/>
-      </w:r>
-      <w:r>
-        <w:instrText xml:space="preserve"> SEQ Рис. \* ARABIC </w:instrText>
-      </w:r>
-      <w:r>
-        <w:fldChar w:fldCharType="separate"/>
-      </w:r>
-      <w:r>
-        <w:rPr>
-          <w:noProof/>
-        </w:rPr>
-        <w:t>9</w:t>
-      </w:r>
-      <w:r>
-        <w:fldChar w:fldCharType="end"/>
-      </w:r>
+      <w:fldSimple w:instr=" SEQ Рис. \* ARABIC ">
+        <w:r>
+          <w:rPr>
+            <w:noProof/>
+          </w:rPr>
+          <w:t>9</w:t>
+        </w:r>
+      </w:fldSimple>
       <w:r>
         <w:t>. Выбор разделителя сто</w:t>
       </w:r>
@@ -4311,7 +5155,7 @@
                     <pic:cNvPicPr/>
                   </pic:nvPicPr>
                   <pic:blipFill>
-                    <a:blip r:embed="rId15" cstate="print">
+                    <a:blip r:embed="rId17" cstate="print">
                       <a:extLst>
                         <a:ext uri="{28A0092B-C50C-407E-A947-70E740481C1C}">
                           <a14:useLocalDpi xmlns:a14="http://schemas.microsoft.com/office/drawing/2010/main" val="0"/>
@@ -4345,24 +5189,14 @@
       <w:r>
         <w:t xml:space="preserve">Рис. </w:t>
       </w:r>
-      <w:r>
-        <w:fldChar w:fldCharType="begin"/>
-      </w:r>
-      <w:r>
-        <w:instrText xml:space="preserve"> SEQ Рис. \* ARABIC </w:instrText>
-      </w:r>
-      <w:r>
-        <w:fldChar w:fldCharType="separate"/>
-      </w:r>
-      <w:r>
-        <w:rPr>
-          <w:noProof/>
-        </w:rPr>
-        <w:t>10</w:t>
-      </w:r>
-      <w:r>
-        <w:fldChar w:fldCharType="end"/>
-      </w:r>
+      <w:fldSimple w:instr=" SEQ Рис. \* ARABIC ">
+        <w:r>
+          <w:rPr>
+            <w:noProof/>
+          </w:rPr>
+          <w:t>10</w:t>
+        </w:r>
+      </w:fldSimple>
       <w:r>
         <w:t>. Выбор десятичного разделителя</w:t>
       </w:r>
@@ -4425,7 +5259,7 @@
                     <pic:cNvPicPr/>
                   </pic:nvPicPr>
                   <pic:blipFill>
-                    <a:blip r:embed="rId16">
+                    <a:blip r:embed="rId18">
                       <a:extLst>
                         <a:ext uri="{28A0092B-C50C-407E-A947-70E740481C1C}">
                           <a14:useLocalDpi xmlns:a14="http://schemas.microsoft.com/office/drawing/2010/main" val="0"/>
@@ -4459,24 +5293,14 @@
       <w:r>
         <w:t xml:space="preserve">Рис. </w:t>
       </w:r>
-      <w:r>
-        <w:fldChar w:fldCharType="begin"/>
-      </w:r>
-      <w:r>
-        <w:instrText xml:space="preserve"> SEQ Рис. \* ARABIC </w:instrText>
-      </w:r>
-      <w:r>
-        <w:fldChar w:fldCharType="separate"/>
-      </w:r>
-      <w:r>
-        <w:rPr>
-          <w:noProof/>
-        </w:rPr>
-        <w:t>11</w:t>
-      </w:r>
-      <w:r>
-        <w:fldChar w:fldCharType="end"/>
-      </w:r>
+      <w:fldSimple w:instr=" SEQ Рис. \* ARABIC ">
+        <w:r>
+          <w:rPr>
+            <w:noProof/>
+          </w:rPr>
+          <w:t>11</w:t>
+        </w:r>
+      </w:fldSimple>
       <w:r>
         <w:t>. Данные в верном формате</w:t>
       </w:r>
@@ -4525,9 +5349,6 @@
       <w:pPr>
         <w:ind w:left="360" w:firstLine="0"/>
         <w:jc w:val="both"/>
-        <w:rPr>
-          <w:lang w:val="en-US"/>
-        </w:rPr>
       </w:pPr>
     </w:p>
     <w:p>
@@ -4656,10 +5477,7 @@
         <w:t>2.1.1.</w:t>
       </w:r>
       <w:r>
-        <w:t xml:space="preserve"> </w:t>
-      </w:r>
-      <w:r>
-        <w:t>Простая выборка</w:t>
+        <w:t xml:space="preserve"> Простая выборка</w:t>
       </w:r>
     </w:p>
     <w:p/>
@@ -4917,7 +5735,7 @@
                           <pic:cNvPicPr/>
                         </pic:nvPicPr>
                         <pic:blipFill>
-                          <a:blip r:embed="rId17">
+                          <a:blip r:embed="rId19">
                             <a:extLst>
                               <a:ext uri="{28A0092B-C50C-407E-A947-70E740481C1C}">
                                 <a14:useLocalDpi xmlns:a14="http://schemas.microsoft.com/office/drawing/2010/main" val="0"/>
@@ -5333,7 +6151,7 @@
                 <w:lang w:val="en-US"/>
               </w:rPr>
               <w:drawing>
-                <wp:inline distT="0" distB="0" distL="0" distR="0" wp14:anchorId="283B511F" wp14:editId="2C050478">
+                <wp:inline distT="0" distB="0" distL="0" distR="0" wp14:anchorId="283B511F" wp14:editId="68B788EA">
                   <wp:extent cx="4817110" cy="1502032"/>
                   <wp:effectExtent l="0" t="0" r="0" b="0"/>
                   <wp:docPr id="938854926" name="Рисунок 12" descr="Изображение выглядит как текст, снимок экрана, число, Шрифт&#10;&#10;Содержимое, созданное искусственным интеллектом, может быть неверным."/>
@@ -5348,7 +6166,7 @@
                           <pic:cNvPicPr/>
                         </pic:nvPicPr>
                         <pic:blipFill>
-                          <a:blip r:embed="rId18" cstate="print">
+                          <a:blip r:embed="rId20" cstate="print">
                             <a:extLst>
                               <a:ext uri="{28A0092B-C50C-407E-A947-70E740481C1C}">
                                 <a14:useLocalDpi xmlns:a14="http://schemas.microsoft.com/office/drawing/2010/main" val="0"/>
@@ -5637,7 +6455,7 @@
                 <w:lang w:val="en-US"/>
               </w:rPr>
               <w:drawing>
-                <wp:inline distT="0" distB="0" distL="0" distR="0" wp14:anchorId="01A76FFE" wp14:editId="122ED416">
+                <wp:inline distT="0" distB="0" distL="0" distR="0" wp14:anchorId="01A76FFE" wp14:editId="33052DB7">
                   <wp:extent cx="616585" cy="2385028"/>
                   <wp:effectExtent l="0" t="0" r="5715" b="3175"/>
                   <wp:docPr id="1771356876" name="Рисунок 13" descr="Изображение выглядит как текст, снимок экрана, число, Шрифт&#10;&#10;Содержимое, созданное искусственным интеллектом, может быть неверным."/>
@@ -5652,7 +6470,7 @@
                           <pic:cNvPicPr/>
                         </pic:nvPicPr>
                         <pic:blipFill>
-                          <a:blip r:embed="rId19" cstate="print">
+                          <a:blip r:embed="rId21" cstate="print">
                             <a:extLst>
                               <a:ext uri="{28A0092B-C50C-407E-A947-70E740481C1C}">
                                 <a14:useLocalDpi xmlns:a14="http://schemas.microsoft.com/office/drawing/2010/main" val="0"/>
@@ -5916,7 +6734,7 @@
                 <w:lang w:val="en-US"/>
               </w:rPr>
               <w:drawing>
-                <wp:inline distT="0" distB="0" distL="0" distR="0" wp14:anchorId="00673986" wp14:editId="3731F272">
+                <wp:inline distT="0" distB="0" distL="0" distR="0" wp14:anchorId="00673986" wp14:editId="0FCFD403">
                   <wp:extent cx="617118" cy="1404476"/>
                   <wp:effectExtent l="0" t="0" r="5715" b="0"/>
                   <wp:docPr id="1068050866" name="Рисунок 14" descr="Изображение выглядит как текст, снимок экрана, Шрифт, число&#10;&#10;Содержимое, созданное искусственным интеллектом, может быть неверным."/>
@@ -5931,7 +6749,7 @@
                           <pic:cNvPicPr/>
                         </pic:nvPicPr>
                         <pic:blipFill>
-                          <a:blip r:embed="rId20" cstate="print">
+                          <a:blip r:embed="rId22" cstate="print">
                             <a:extLst>
                               <a:ext uri="{28A0092B-C50C-407E-A947-70E740481C1C}">
                                 <a14:useLocalDpi xmlns:a14="http://schemas.microsoft.com/office/drawing/2010/main" val="0"/>
@@ -6222,7 +7040,7 @@
                 <w:lang w:val="en-US"/>
               </w:rPr>
               <w:drawing>
-                <wp:inline distT="0" distB="0" distL="0" distR="0" wp14:anchorId="23786198" wp14:editId="558700AE">
+                <wp:inline distT="0" distB="0" distL="0" distR="0" wp14:anchorId="23786198" wp14:editId="7BEEB62D">
                   <wp:extent cx="640859" cy="1458505"/>
                   <wp:effectExtent l="0" t="0" r="0" b="2540"/>
                   <wp:docPr id="675374366" name="Рисунок 15" descr="Изображение выглядит как текст, снимок экрана, Шрифт, число&#10;&#10;Содержимое, созданное искусственным интеллектом, может быть неверным."/>
@@ -6237,7 +7055,7 @@
                           <pic:cNvPicPr/>
                         </pic:nvPicPr>
                         <pic:blipFill>
-                          <a:blip r:embed="rId20" cstate="print">
+                          <a:blip r:embed="rId22" cstate="print">
                             <a:extLst>
                               <a:ext uri="{28A0092B-C50C-407E-A947-70E740481C1C}">
                                 <a14:useLocalDpi xmlns:a14="http://schemas.microsoft.com/office/drawing/2010/main" val="0"/>
@@ -6558,7 +7376,7 @@
                           <pic:cNvPicPr/>
                         </pic:nvPicPr>
                         <pic:blipFill>
-                          <a:blip r:embed="rId21" cstate="print">
+                          <a:blip r:embed="rId23" cstate="print">
                             <a:extLst>
                               <a:ext uri="{28A0092B-C50C-407E-A947-70E740481C1C}">
                                 <a14:useLocalDpi xmlns:a14="http://schemas.microsoft.com/office/drawing/2010/main" val="0"/>
@@ -6898,7 +7716,7 @@
                 <w:lang w:val="en-US"/>
               </w:rPr>
               <w:drawing>
-                <wp:inline distT="0" distB="0" distL="0" distR="0" wp14:anchorId="0FD98318" wp14:editId="16901A8D">
+                <wp:inline distT="0" distB="0" distL="0" distR="0" wp14:anchorId="0FD98318" wp14:editId="61044598">
                   <wp:extent cx="2704289" cy="2704289"/>
                   <wp:effectExtent l="0" t="0" r="1270" b="1270"/>
                   <wp:docPr id="1340980998" name="Рисунок 17" descr="Изображение выглядит как текст, снимок экрана, число, Шрифт&#10;&#10;Содержимое, созданное искусственным интеллектом, может быть неверным."/>
@@ -6913,7 +7731,7 @@
                           <pic:cNvPicPr/>
                         </pic:nvPicPr>
                         <pic:blipFill>
-                          <a:blip r:embed="rId22" cstate="print">
+                          <a:blip r:embed="rId24" cstate="print">
                             <a:extLst>
                               <a:ext uri="{28A0092B-C50C-407E-A947-70E740481C1C}">
                                 <a14:useLocalDpi xmlns:a14="http://schemas.microsoft.com/office/drawing/2010/main" val="0"/>
@@ -7234,7 +8052,7 @@
                 <w:lang w:val="en-US"/>
               </w:rPr>
               <w:drawing>
-                <wp:inline distT="0" distB="0" distL="0" distR="0" wp14:anchorId="7999FAFF" wp14:editId="30E25E5A">
+                <wp:inline distT="0" distB="0" distL="0" distR="0" wp14:anchorId="7999FAFF" wp14:editId="5C4F15CD">
                   <wp:extent cx="2500009" cy="2557981"/>
                   <wp:effectExtent l="0" t="0" r="1905" b="0"/>
                   <wp:docPr id="733182855" name="Рисунок 18" descr="Изображение выглядит как текст, снимок экрана, число, Шрифт&#10;&#10;Содержимое, созданное искусственным интеллектом, может быть неверным."/>
@@ -7249,7 +8067,7 @@
                           <pic:cNvPicPr/>
                         </pic:nvPicPr>
                         <pic:blipFill>
-                          <a:blip r:embed="rId23" cstate="print">
+                          <a:blip r:embed="rId25" cstate="print">
                             <a:extLst>
                               <a:ext uri="{28A0092B-C50C-407E-A947-70E740481C1C}">
                                 <a14:useLocalDpi xmlns:a14="http://schemas.microsoft.com/office/drawing/2010/main" val="0"/>
@@ -7697,7 +8515,7 @@
                           <pic:cNvPicPr/>
                         </pic:nvPicPr>
                         <pic:blipFill>
-                          <a:blip r:embed="rId24">
+                          <a:blip r:embed="rId26">
                             <a:extLst>
                               <a:ext uri="{28A0092B-C50C-407E-A947-70E740481C1C}">
                                 <a14:useLocalDpi xmlns:a14="http://schemas.microsoft.com/office/drawing/2010/main" val="0"/>
@@ -8138,7 +8956,7 @@
                           <pic:cNvPicPr/>
                         </pic:nvPicPr>
                         <pic:blipFill>
-                          <a:blip r:embed="rId25">
+                          <a:blip r:embed="rId27">
                             <a:extLst>
                               <a:ext uri="{28A0092B-C50C-407E-A947-70E740481C1C}">
                                 <a14:useLocalDpi xmlns:a14="http://schemas.microsoft.com/office/drawing/2010/main" val="0"/>
@@ -8613,7 +9431,7 @@
                 <w:lang w:val="en-US"/>
               </w:rPr>
               <w:drawing>
-                <wp:inline distT="0" distB="0" distL="0" distR="0" wp14:anchorId="6D0B3596" wp14:editId="2C6F86E3">
+                <wp:inline distT="0" distB="0" distL="0" distR="0" wp14:anchorId="6D0B3596" wp14:editId="71080906">
                   <wp:extent cx="2977806" cy="585190"/>
                   <wp:effectExtent l="0" t="0" r="0" b="0"/>
                   <wp:docPr id="675245591" name="Рисунок 21" descr="Изображение выглядит как текст, снимок экрана, Шрифт, линия&#10;&#10;Содержимое, созданное искусственным интеллектом, может быть неверным."/>
@@ -8628,7 +9446,7 @@
                           <pic:cNvPicPr/>
                         </pic:nvPicPr>
                         <pic:blipFill>
-                          <a:blip r:embed="rId26" cstate="print">
+                          <a:blip r:embed="rId28" cstate="print">
                             <a:extLst>
                               <a:ext uri="{28A0092B-C50C-407E-A947-70E740481C1C}">
                                 <a14:useLocalDpi xmlns:a14="http://schemas.microsoft.com/office/drawing/2010/main" val="0"/>
@@ -8664,10 +9482,7 @@
         <w:t>2.3.2.</w:t>
       </w:r>
       <w:r>
-        <w:t xml:space="preserve"> </w:t>
-      </w:r>
-      <w:r>
-        <w:t>Использование BETWEEN</w:t>
+        <w:t xml:space="preserve"> Использование BETWEEN</w:t>
       </w:r>
     </w:p>
     <w:p/>
@@ -8926,7 +9741,7 @@
                 <w:lang w:val="en-US"/>
               </w:rPr>
               <w:drawing>
-                <wp:inline distT="0" distB="0" distL="0" distR="0" wp14:anchorId="3C5447EC" wp14:editId="7D61CFD8">
+                <wp:inline distT="0" distB="0" distL="0" distR="0" wp14:anchorId="3C5447EC" wp14:editId="13FD21D8">
                   <wp:extent cx="1284051" cy="938345"/>
                   <wp:effectExtent l="0" t="0" r="0" b="1905"/>
                   <wp:docPr id="117909662" name="Рисунок 22" descr="Изображение выглядит как текст, снимок экрана, число, Шрифт&#10;&#10;Содержимое, созданное искусственным интеллектом, может быть неверным."/>
@@ -8941,7 +9756,7 @@
                           <pic:cNvPicPr/>
                         </pic:nvPicPr>
                         <pic:blipFill>
-                          <a:blip r:embed="rId27" cstate="print">
+                          <a:blip r:embed="rId29" cstate="print">
                             <a:extLst>
                               <a:ext uri="{28A0092B-C50C-407E-A947-70E740481C1C}">
                                 <a14:useLocalDpi xmlns:a14="http://schemas.microsoft.com/office/drawing/2010/main" val="0"/>
@@ -9328,7 +10143,7 @@
                 <w:lang w:val="en-US"/>
               </w:rPr>
               <w:drawing>
-                <wp:inline distT="0" distB="0" distL="0" distR="0" wp14:anchorId="5DDAD5C1" wp14:editId="02B5393F">
+                <wp:inline distT="0" distB="0" distL="0" distR="0" wp14:anchorId="5DDAD5C1" wp14:editId="13072402">
                   <wp:extent cx="1663430" cy="648960"/>
                   <wp:effectExtent l="0" t="0" r="635" b="0"/>
                   <wp:docPr id="640125045" name="Рисунок 23"/>
@@ -9343,7 +10158,7 @@
                           <pic:cNvPicPr/>
                         </pic:nvPicPr>
                         <pic:blipFill>
-                          <a:blip r:embed="rId28" cstate="print">
+                          <a:blip r:embed="rId30" cstate="print">
                             <a:extLst>
                               <a:ext uri="{28A0092B-C50C-407E-A947-70E740481C1C}">
                                 <a14:useLocalDpi xmlns:a14="http://schemas.microsoft.com/office/drawing/2010/main" val="0"/>
@@ -9722,107 +10537,7 @@
                 <w:highlight w:val="green"/>
                 <w:lang w:val="en-US"/>
               </w:rPr>
-              <w:t>WHERE     Начало BETWEEN 1</w:t>
-            </w:r>
-            <w:r>
-              <w:rPr>
-                <w:rFonts w:ascii="Cascadia Mono" w:hAnsi="Cascadia Mono"/>
-                <w:sz w:val="20"/>
-                <w:szCs w:val="20"/>
-                <w:highlight w:val="green"/>
-                <w:lang w:val="en-US"/>
-              </w:rPr>
-              <w:t>/</w:t>
-            </w:r>
-            <w:r>
-              <w:rPr>
-                <w:rFonts w:ascii="Cascadia Mono" w:hAnsi="Cascadia Mono"/>
-                <w:sz w:val="20"/>
-                <w:szCs w:val="20"/>
-                <w:highlight w:val="green"/>
-                <w:lang w:val="en-US"/>
-              </w:rPr>
-              <w:t>9</w:t>
-            </w:r>
-            <w:r>
-              <w:rPr>
-                <w:rFonts w:ascii="Cascadia Mono" w:hAnsi="Cascadia Mono"/>
-                <w:sz w:val="20"/>
-                <w:szCs w:val="20"/>
-                <w:highlight w:val="green"/>
-                <w:lang w:val="en-US"/>
-              </w:rPr>
-              <w:t>/</w:t>
-            </w:r>
-            <w:r>
-              <w:rPr>
-                <w:rFonts w:ascii="Cascadia Mono" w:hAnsi="Cascadia Mono"/>
-                <w:sz w:val="20"/>
-                <w:szCs w:val="20"/>
-                <w:highlight w:val="green"/>
-                <w:lang w:val="en-US"/>
-              </w:rPr>
-              <w:t>1993 AND 31</w:t>
-            </w:r>
-            <w:r>
-              <w:rPr>
-                <w:rFonts w:ascii="Cascadia Mono" w:hAnsi="Cascadia Mono"/>
-                <w:sz w:val="20"/>
-                <w:szCs w:val="20"/>
-                <w:highlight w:val="green"/>
-                <w:lang w:val="en-US"/>
-              </w:rPr>
-              <w:t>/</w:t>
-            </w:r>
-            <w:r>
-              <w:rPr>
-                <w:rFonts w:ascii="Cascadia Mono" w:hAnsi="Cascadia Mono"/>
-                <w:sz w:val="20"/>
-                <w:szCs w:val="20"/>
-                <w:highlight w:val="green"/>
-                <w:lang w:val="en-US"/>
-              </w:rPr>
-              <w:t>8</w:t>
-            </w:r>
-            <w:r>
-              <w:rPr>
-                <w:rFonts w:ascii="Cascadia Mono" w:hAnsi="Cascadia Mono"/>
-                <w:sz w:val="20"/>
-                <w:szCs w:val="20"/>
-                <w:highlight w:val="green"/>
-                <w:lang w:val="en-US"/>
-              </w:rPr>
-              <w:t>/</w:t>
-            </w:r>
-            <w:r>
-              <w:rPr>
-                <w:rFonts w:ascii="Cascadia Mono" w:hAnsi="Cascadia Mono"/>
-                <w:sz w:val="20"/>
-                <w:szCs w:val="20"/>
-                <w:highlight w:val="green"/>
-                <w:lang w:val="en-US"/>
-              </w:rPr>
-              <w:t>199</w:t>
-            </w:r>
-            <w:r>
-              <w:rPr>
-                <w:rFonts w:ascii="Cascadia Mono" w:hAnsi="Cascadia Mono"/>
-                <w:sz w:val="20"/>
-                <w:szCs w:val="20"/>
-                <w:highlight w:val="green"/>
-                <w:lang w:val="en-US"/>
-              </w:rPr>
-              <w:t>4</w:t>
-            </w:r>
-            <w:r>
-              <w:rPr>
-                <w:rFonts w:ascii="Cascadia Mono" w:hAnsi="Cascadia Mono"/>
-                <w:sz w:val="20"/>
-                <w:szCs w:val="20"/>
-                <w:highlight w:val="green"/>
-                <w:lang w:val="en-US"/>
-              </w:rPr>
-              <w:t>;</w:t>
+              <w:t>WHERE     Начало BETWEEN 1/9/1993 AND 31/8/1994;</w:t>
             </w:r>
           </w:p>
           <w:p>
@@ -9883,7 +10598,7 @@
                 <w:lang w:val="en-US"/>
               </w:rPr>
               <w:drawing>
-                <wp:inline distT="0" distB="0" distL="0" distR="0" wp14:anchorId="22291DCD" wp14:editId="541347C5">
+                <wp:inline distT="0" distB="0" distL="0" distR="0" wp14:anchorId="22291DCD" wp14:editId="2A261BD9">
                   <wp:extent cx="1011677" cy="451153"/>
                   <wp:effectExtent l="0" t="0" r="4445" b="6350"/>
                   <wp:docPr id="292066338" name="Рисунок 24"/>
@@ -9898,7 +10613,7 @@
                           <pic:cNvPicPr/>
                         </pic:nvPicPr>
                         <pic:blipFill>
-                          <a:blip r:embed="rId29" cstate="print">
+                          <a:blip r:embed="rId31" cstate="print">
                             <a:extLst>
                               <a:ext uri="{28A0092B-C50C-407E-A947-70E740481C1C}">
                                 <a14:useLocalDpi xmlns:a14="http://schemas.microsoft.com/office/drawing/2010/main" val="0"/>
@@ -10019,7 +10734,6 @@
                 <w:color w:val="000000" w:themeColor="text1"/>
                 <w:sz w:val="24"/>
                 <w:szCs w:val="24"/>
-                <w:lang w:val="en-US"/>
               </w:rPr>
             </w:pPr>
             <w:r>
@@ -10037,7 +10751,6 @@
               <w:rPr>
                 <w:sz w:val="24"/>
                 <w:szCs w:val="24"/>
-                <w:lang w:val="en-US"/>
               </w:rPr>
             </w:pPr>
           </w:p>
@@ -10262,6 +10975,7 @@
                 <w:rFonts w:ascii="Cascadia Mono" w:hAnsi="Cascadia Mono"/>
                 <w:sz w:val="20"/>
                 <w:szCs w:val="20"/>
+                <w:lang w:val="en-US"/>
               </w:rPr>
             </w:pPr>
             <w:r>
@@ -10413,7 +11127,7 @@
                 <w:lang w:val="en-US"/>
               </w:rPr>
               <w:drawing>
-                <wp:inline distT="0" distB="0" distL="0" distR="0" wp14:anchorId="63D58CD9" wp14:editId="5476CA1A">
+                <wp:inline distT="0" distB="0" distL="0" distR="0" wp14:anchorId="63D58CD9" wp14:editId="2BA3133F">
                   <wp:extent cx="1472389" cy="570454"/>
                   <wp:effectExtent l="0" t="0" r="1270" b="1270"/>
                   <wp:docPr id="2098930955" name="Рисунок 25" descr="Изображение выглядит как текст, снимок экрана, Шрифт, дизайн&#10;&#10;Содержимое, созданное искусственным интеллектом, может быть неверным."/>
@@ -10428,7 +11142,7 @@
                           <pic:cNvPicPr/>
                         </pic:nvPicPr>
                         <pic:blipFill>
-                          <a:blip r:embed="rId30" cstate="print">
+                          <a:blip r:embed="rId32" cstate="print">
                             <a:extLst>
                               <a:ext uri="{28A0092B-C50C-407E-A947-70E740481C1C}">
                                 <a14:useLocalDpi xmlns:a14="http://schemas.microsoft.com/office/drawing/2010/main" val="0"/>
@@ -10814,7 +11528,7 @@
                           <pic:cNvPicPr/>
                         </pic:nvPicPr>
                         <pic:blipFill>
-                          <a:blip r:embed="rId31">
+                          <a:blip r:embed="rId33">
                             <a:extLst>
                               <a:ext uri="{28A0092B-C50C-407E-A947-70E740481C1C}">
                                 <a14:useLocalDpi xmlns:a14="http://schemas.microsoft.com/office/drawing/2010/main" val="0"/>
@@ -11317,6 +12031,7 @@
                 <w:rFonts w:ascii="Cascadia Mono" w:hAnsi="Cascadia Mono"/>
                 <w:sz w:val="20"/>
                 <w:szCs w:val="20"/>
+                <w:lang w:val="en-US"/>
               </w:rPr>
               <w:t xml:space="preserve">     </w:t>
             </w:r>
@@ -11333,6 +12048,7 @@
                 <w:rFonts w:ascii="Cascadia Mono" w:hAnsi="Cascadia Mono"/>
                 <w:sz w:val="20"/>
                 <w:szCs w:val="20"/>
+                <w:lang w:val="en-US"/>
               </w:rPr>
               <w:t>=</w:t>
             </w:r>
@@ -11342,6 +12058,7 @@
                 <w:sz w:val="20"/>
                 <w:szCs w:val="20"/>
                 <w:highlight w:val="green"/>
+                <w:lang w:val="en-US"/>
               </w:rPr>
               <w:t>'</w:t>
             </w:r>
@@ -11359,6 +12076,7 @@
                 <w:sz w:val="20"/>
                 <w:szCs w:val="20"/>
                 <w:highlight w:val="green"/>
+                <w:lang w:val="en-US"/>
               </w:rPr>
               <w:t>'</w:t>
             </w:r>
@@ -11367,6 +12085,7 @@
                 <w:rFonts w:ascii="Cascadia Mono" w:hAnsi="Cascadia Mono"/>
                 <w:sz w:val="20"/>
                 <w:szCs w:val="20"/>
+                <w:lang w:val="en-US"/>
               </w:rPr>
               <w:t xml:space="preserve"> </w:t>
             </w:r>
@@ -11384,6 +12103,7 @@
                 <w:rFonts w:ascii="Cascadia Mono" w:hAnsi="Cascadia Mono"/>
                 <w:sz w:val="20"/>
                 <w:szCs w:val="20"/>
+                <w:lang w:val="en-US"/>
               </w:rPr>
               <w:t xml:space="preserve"> </w:t>
             </w:r>
@@ -11400,6 +12120,7 @@
                 <w:rFonts w:ascii="Cascadia Mono" w:hAnsi="Cascadia Mono"/>
                 <w:sz w:val="20"/>
                 <w:szCs w:val="20"/>
+                <w:lang w:val="en-US"/>
               </w:rPr>
               <w:t>=</w:t>
             </w:r>
@@ -11409,6 +12130,7 @@
                 <w:sz w:val="20"/>
                 <w:szCs w:val="20"/>
                 <w:highlight w:val="green"/>
+                <w:lang w:val="en-US"/>
               </w:rPr>
               <w:t>'</w:t>
             </w:r>
@@ -11426,6 +12148,7 @@
                 <w:sz w:val="20"/>
                 <w:szCs w:val="20"/>
                 <w:highlight w:val="green"/>
+                <w:lang w:val="en-US"/>
               </w:rPr>
               <w:t>'</w:t>
             </w:r>
@@ -11434,6 +12157,7 @@
                 <w:rFonts w:ascii="Cascadia Mono" w:hAnsi="Cascadia Mono"/>
                 <w:sz w:val="20"/>
                 <w:szCs w:val="20"/>
+                <w:lang w:val="en-US"/>
               </w:rPr>
               <w:t xml:space="preserve"> </w:t>
             </w:r>
@@ -11451,6 +12175,7 @@
                 <w:rFonts w:ascii="Cascadia Mono" w:hAnsi="Cascadia Mono"/>
                 <w:sz w:val="20"/>
                 <w:szCs w:val="20"/>
+                <w:lang w:val="en-US"/>
               </w:rPr>
               <w:t xml:space="preserve"> </w:t>
             </w:r>
@@ -11467,6 +12192,7 @@
                 <w:rFonts w:ascii="Cascadia Mono" w:hAnsi="Cascadia Mono"/>
                 <w:sz w:val="20"/>
                 <w:szCs w:val="20"/>
+                <w:lang w:val="en-US"/>
               </w:rPr>
               <w:t>=</w:t>
             </w:r>
@@ -11476,6 +12202,7 @@
                 <w:sz w:val="20"/>
                 <w:szCs w:val="20"/>
                 <w:highlight w:val="green"/>
+                <w:lang w:val="en-US"/>
               </w:rPr>
               <w:t>'</w:t>
             </w:r>
@@ -11493,6 +12220,7 @@
                 <w:sz w:val="20"/>
                 <w:szCs w:val="20"/>
                 <w:highlight w:val="green"/>
+                <w:lang w:val="en-US"/>
               </w:rPr>
               <w:t>'</w:t>
             </w:r>
@@ -11501,6 +12229,7 @@
                 <w:rFonts w:ascii="Cascadia Mono" w:hAnsi="Cascadia Mono"/>
                 <w:sz w:val="20"/>
                 <w:szCs w:val="20"/>
+                <w:lang w:val="en-US"/>
               </w:rPr>
               <w:t>;</w:t>
             </w:r>
@@ -11578,7 +12307,7 @@
                           <pic:cNvPicPr/>
                         </pic:nvPicPr>
                         <pic:blipFill>
-                          <a:blip r:embed="rId32">
+                          <a:blip r:embed="rId34">
                             <a:extLst>
                               <a:ext uri="{28A0092B-C50C-407E-A947-70E740481C1C}">
                                 <a14:useLocalDpi xmlns:a14="http://schemas.microsoft.com/office/drawing/2010/main" val="0"/>
@@ -12136,7 +12865,7 @@
                 <w:lang w:val="en-US"/>
               </w:rPr>
               <w:drawing>
-                <wp:inline distT="0" distB="0" distL="0" distR="0" wp14:anchorId="5A584E80" wp14:editId="6C25F800">
+                <wp:inline distT="0" distB="0" distL="0" distR="0" wp14:anchorId="5A584E80" wp14:editId="18C07DB4">
                   <wp:extent cx="2195749" cy="881505"/>
                   <wp:effectExtent l="0" t="0" r="1905" b="0"/>
                   <wp:docPr id="2129301470" name="Рисунок 28"/>
@@ -12151,7 +12880,7 @@
                           <pic:cNvPicPr/>
                         </pic:nvPicPr>
                         <pic:blipFill>
-                          <a:blip r:embed="rId33" cstate="print">
+                          <a:blip r:embed="rId35" cstate="print">
                             <a:extLst>
                               <a:ext uri="{28A0092B-C50C-407E-A947-70E740481C1C}">
                                 <a14:useLocalDpi xmlns:a14="http://schemas.microsoft.com/office/drawing/2010/main" val="0"/>
@@ -12193,10 +12922,7 @@
         <w:t>2.3.5.</w:t>
       </w:r>
       <w:r>
-        <w:t xml:space="preserve"> </w:t>
-      </w:r>
-      <w:r>
-        <w:t>Вовлечение неопределенного значения</w:t>
+        <w:t xml:space="preserve"> Вовлечение неопределенного значения</w:t>
       </w:r>
     </w:p>
     <w:p/>
@@ -12564,7 +13290,7 @@
                           <pic:cNvPicPr/>
                         </pic:nvPicPr>
                         <pic:blipFill>
-                          <a:blip r:embed="rId34">
+                          <a:blip r:embed="rId36">
                             <a:extLst>
                               <a:ext uri="{28A0092B-C50C-407E-A947-70E740481C1C}">
                                 <a14:useLocalDpi xmlns:a14="http://schemas.microsoft.com/office/drawing/2010/main" val="0"/>
@@ -12951,7 +13677,7 @@
                 <w:lang w:val="en-US"/>
               </w:rPr>
               <w:drawing>
-                <wp:inline distT="0" distB="0" distL="0" distR="0" wp14:anchorId="73600054" wp14:editId="35C004AC">
+                <wp:inline distT="0" distB="0" distL="0" distR="0" wp14:anchorId="73600054" wp14:editId="63DC62A0">
                   <wp:extent cx="387350" cy="2479040"/>
                   <wp:effectExtent l="0" t="0" r="6350" b="0"/>
                   <wp:docPr id="93199684" name="Рисунок 31" descr="Изображение выглядит как текст, снимок экрана, число&#10;&#10;Содержимое, созданное искусственным интеллектом, может быть неверным."/>
@@ -12966,7 +13692,7 @@
                           <pic:cNvPicPr/>
                         </pic:nvPicPr>
                         <pic:blipFill>
-                          <a:blip r:embed="rId35" cstate="print">
+                          <a:blip r:embed="rId37" cstate="print">
                             <a:extLst>
                               <a:ext uri="{28A0092B-C50C-407E-A947-70E740481C1C}">
                                 <a14:useLocalDpi xmlns:a14="http://schemas.microsoft.com/office/drawing/2010/main" val="0"/>
@@ -13325,7 +14051,7 @@
                 <w:lang w:val="en-US"/>
               </w:rPr>
               <w:drawing>
-                <wp:inline distT="0" distB="0" distL="0" distR="0" wp14:anchorId="7CA1B3F3" wp14:editId="63EF734E">
+                <wp:inline distT="0" distB="0" distL="0" distR="0" wp14:anchorId="7CA1B3F3" wp14:editId="0C9FA728">
                   <wp:extent cx="2033081" cy="2700546"/>
                   <wp:effectExtent l="0" t="0" r="0" b="5080"/>
                   <wp:docPr id="31371176" name="Рисунок 32" descr="Изображение выглядит как текст, снимок экрана, число, Шрифт&#10;&#10;Содержимое, созданное искусственным интеллектом, может быть неверным."/>
@@ -13340,7 +14066,7 @@
                           <pic:cNvPicPr/>
                         </pic:nvPicPr>
                         <pic:blipFill>
-                          <a:blip r:embed="rId36" cstate="print">
+                          <a:blip r:embed="rId38" cstate="print">
                             <a:extLst>
                               <a:ext uri="{28A0092B-C50C-407E-A947-70E740481C1C}">
                                 <a14:useLocalDpi xmlns:a14="http://schemas.microsoft.com/office/drawing/2010/main" val="0"/>
@@ -13743,7 +14469,7 @@
                 <w:lang w:val="en-US"/>
               </w:rPr>
               <w:drawing>
-                <wp:inline distT="0" distB="0" distL="0" distR="0" wp14:anchorId="75175AAF" wp14:editId="2B5B2D8E">
+                <wp:inline distT="0" distB="0" distL="0" distR="0" wp14:anchorId="75175AAF" wp14:editId="1631B955">
                   <wp:extent cx="4149449" cy="2684834"/>
                   <wp:effectExtent l="0" t="0" r="3810" b="0"/>
                   <wp:docPr id="373386834" name="Рисунок 33" descr="Изображение выглядит как текст, число, снимок экрана, Шрифт&#10;&#10;Содержимое, созданное искусственным интеллектом, может быть неверным."/>
@@ -13758,7 +14484,7 @@
                           <pic:cNvPicPr/>
                         </pic:nvPicPr>
                         <pic:blipFill>
-                          <a:blip r:embed="rId37" cstate="print">
+                          <a:blip r:embed="rId39" cstate="print">
                             <a:extLst>
                               <a:ext uri="{28A0092B-C50C-407E-A947-70E740481C1C}">
                                 <a14:useLocalDpi xmlns:a14="http://schemas.microsoft.com/office/drawing/2010/main" val="0"/>
@@ -14115,7 +14841,7 @@
                           <pic:cNvPicPr/>
                         </pic:nvPicPr>
                         <pic:blipFill>
-                          <a:blip r:embed="rId38" cstate="print">
+                          <a:blip r:embed="rId40" cstate="print">
                             <a:extLst>
                               <a:ext uri="{28A0092B-C50C-407E-A947-70E740481C1C}">
                                 <a14:useLocalDpi xmlns:a14="http://schemas.microsoft.com/office/drawing/2010/main" val="0"/>
@@ -14157,10 +14883,7 @@
         <w:t>2.5.2.</w:t>
       </w:r>
       <w:r>
-        <w:t xml:space="preserve"> </w:t>
-      </w:r>
-      <w:r>
-        <w:t>Функции без использования фразы GROUP BY</w:t>
+        <w:t xml:space="preserve"> Функции без использования фразы GROUP BY</w:t>
       </w:r>
     </w:p>
     <w:p/>
@@ -14513,7 +15236,7 @@
                 <w:lang w:val="en-US"/>
               </w:rPr>
               <w:drawing>
-                <wp:inline distT="0" distB="0" distL="0" distR="0" wp14:anchorId="6D04BC6B" wp14:editId="0EE33E98">
+                <wp:inline distT="0" distB="0" distL="0" distR="0" wp14:anchorId="6D04BC6B" wp14:editId="67DFF7C9">
                   <wp:extent cx="1164424" cy="334867"/>
                   <wp:effectExtent l="0" t="0" r="4445" b="0"/>
                   <wp:docPr id="1848607277" name="Рисунок 35" descr="Изображение выглядит как текст, снимок экрана, Шрифт, линия&#10;&#10;Содержимое, созданное искусственным интеллектом, может быть неверным."/>
@@ -14528,7 +15251,7 @@
                           <pic:cNvPicPr/>
                         </pic:nvPicPr>
                         <pic:blipFill>
-                          <a:blip r:embed="rId39" cstate="print">
+                          <a:blip r:embed="rId41" cstate="print">
                             <a:extLst>
                               <a:ext uri="{28A0092B-C50C-407E-A947-70E740481C1C}">
                                 <a14:useLocalDpi xmlns:a14="http://schemas.microsoft.com/office/drawing/2010/main" val="0"/>
@@ -15279,7 +16002,7 @@
                 <w:lang w:val="en-US"/>
               </w:rPr>
               <w:drawing>
-                <wp:inline distT="0" distB="0" distL="0" distR="0" wp14:anchorId="0797AFF7" wp14:editId="2FCE0D5C">
+                <wp:inline distT="0" distB="0" distL="0" distR="0" wp14:anchorId="0797AFF7" wp14:editId="631CEDE9">
                   <wp:extent cx="1826368" cy="319244"/>
                   <wp:effectExtent l="0" t="0" r="2540" b="0"/>
                   <wp:docPr id="1585212508" name="Рисунок 36" descr="Изображение выглядит как текст, снимок экрана, Шрифт, линия&#10;&#10;Содержимое, созданное искусственным интеллектом, может быть неверным."/>
@@ -15294,7 +16017,7 @@
                           <pic:cNvPicPr/>
                         </pic:nvPicPr>
                         <pic:blipFill>
-                          <a:blip r:embed="rId40" cstate="print">
+                          <a:blip r:embed="rId42" cstate="print">
                             <a:extLst>
                               <a:ext uri="{28A0092B-C50C-407E-A947-70E740481C1C}">
                                 <a14:useLocalDpi xmlns:a14="http://schemas.microsoft.com/office/drawing/2010/main" val="0"/>
@@ -15744,7 +16467,7 @@
                           <pic:cNvPicPr/>
                         </pic:nvPicPr>
                         <pic:blipFill>
-                          <a:blip r:embed="rId41">
+                          <a:blip r:embed="rId43">
                             <a:extLst>
                               <a:ext uri="{28A0092B-C50C-407E-A947-70E740481C1C}">
                                 <a14:useLocalDpi xmlns:a14="http://schemas.microsoft.com/office/drawing/2010/main" val="0"/>
@@ -16169,7 +16892,7 @@
                           <pic:cNvPicPr/>
                         </pic:nvPicPr>
                         <pic:blipFill>
-                          <a:blip r:embed="rId42">
+                          <a:blip r:embed="rId44">
                             <a:extLst>
                               <a:ext uri="{28A0092B-C50C-407E-A947-70E740481C1C}">
                                 <a14:useLocalDpi xmlns:a14="http://schemas.microsoft.com/office/drawing/2010/main" val="0"/>
@@ -16561,7 +17284,7 @@
                 <w:lang w:val="en-US"/>
               </w:rPr>
               <w:drawing>
-                <wp:inline distT="0" distB="0" distL="0" distR="0" wp14:anchorId="27F30CF8" wp14:editId="0E5D4636">
+                <wp:inline distT="0" distB="0" distL="0" distR="0" wp14:anchorId="27F30CF8" wp14:editId="01E5ACA5">
                   <wp:extent cx="1284051" cy="348086"/>
                   <wp:effectExtent l="0" t="0" r="0" b="0"/>
                   <wp:docPr id="568005563" name="Рисунок 39" descr="Изображение выглядит как текст, снимок экрана, Шрифт, Прямоугольник&#10;&#10;Содержимое, созданное искусственным интеллектом, может быть неверным."/>
@@ -16576,7 +17299,7 @@
                           <pic:cNvPicPr/>
                         </pic:nvPicPr>
                         <pic:blipFill>
-                          <a:blip r:embed="rId43" cstate="print">
+                          <a:blip r:embed="rId45" cstate="print">
                             <a:extLst>
                               <a:ext uri="{28A0092B-C50C-407E-A947-70E740481C1C}">
                                 <a14:useLocalDpi xmlns:a14="http://schemas.microsoft.com/office/drawing/2010/main" val="0"/>
@@ -16612,10 +17335,7 @@
         <w:t>2.5.3.</w:t>
       </w:r>
       <w:r>
-        <w:t xml:space="preserve"> </w:t>
-      </w:r>
-      <w:r>
-        <w:t>Фраза GROUP BY</w:t>
+        <w:t xml:space="preserve"> Фраза GROUP BY</w:t>
       </w:r>
     </w:p>
     <w:p/>
@@ -16900,7 +17620,7 @@
                 <w:lang w:val="en-US"/>
               </w:rPr>
               <w:drawing>
-                <wp:inline distT="0" distB="0" distL="0" distR="0" wp14:anchorId="769CC1D8" wp14:editId="561A1645">
+                <wp:inline distT="0" distB="0" distL="0" distR="0" wp14:anchorId="769CC1D8" wp14:editId="6C2FD405">
                   <wp:extent cx="827418" cy="2051065"/>
                   <wp:effectExtent l="0" t="0" r="0" b="0"/>
                   <wp:docPr id="58898209" name="Рисунок 40" descr="Изображение выглядит как текст, снимок экрана, число, Шрифт&#10;&#10;Содержимое, созданное искусственным интеллектом, может быть неверным."/>
@@ -16915,7 +17635,7 @@
                           <pic:cNvPicPr/>
                         </pic:nvPicPr>
                         <pic:blipFill>
-                          <a:blip r:embed="rId44" cstate="print">
+                          <a:blip r:embed="rId46" cstate="print">
                             <a:extLst>
                               <a:ext uri="{28A0092B-C50C-407E-A947-70E740481C1C}">
                                 <a14:useLocalDpi xmlns:a14="http://schemas.microsoft.com/office/drawing/2010/main" val="0"/>
@@ -17320,7 +18040,7 @@
                 <w:lang w:val="en-US"/>
               </w:rPr>
               <w:drawing>
-                <wp:inline distT="0" distB="0" distL="0" distR="0" wp14:anchorId="3D2F0007" wp14:editId="5ED61615">
+                <wp:inline distT="0" distB="0" distL="0" distR="0" wp14:anchorId="3D2F0007" wp14:editId="7357038B">
                   <wp:extent cx="746125" cy="1862667"/>
                   <wp:effectExtent l="0" t="0" r="3175" b="4445"/>
                   <wp:docPr id="837148965" name="Рисунок 41" descr="Изображение выглядит как текст, снимок экрана, число, Шрифт&#10;&#10;Содержимое, созданное искусственным интеллектом, может быть неверным."/>
@@ -17335,7 +18055,7 @@
                           <pic:cNvPicPr/>
                         </pic:nvPicPr>
                         <pic:blipFill>
-                          <a:blip r:embed="rId45" cstate="print">
+                          <a:blip r:embed="rId47" cstate="print">
                             <a:extLst>
                               <a:ext uri="{28A0092B-C50C-407E-A947-70E740481C1C}">
                                 <a14:useLocalDpi xmlns:a14="http://schemas.microsoft.com/office/drawing/2010/main" val="0"/>
@@ -17740,7 +18460,7 @@
                 <w:lang w:val="en-US"/>
               </w:rPr>
               <w:drawing>
-                <wp:inline distT="0" distB="0" distL="0" distR="0" wp14:anchorId="2D7194CD" wp14:editId="152C4815">
+                <wp:inline distT="0" distB="0" distL="0" distR="0" wp14:anchorId="2D7194CD" wp14:editId="6D2659FC">
                   <wp:extent cx="746125" cy="1849549"/>
                   <wp:effectExtent l="0" t="0" r="3175" b="5080"/>
                   <wp:docPr id="1244849168" name="Рисунок 42" descr="Изображение выглядит как текст, снимок экрана, число, Шрифт&#10;&#10;Содержимое, созданное искусственным интеллектом, может быть неверным."/>
@@ -17755,7 +18475,7 @@
                           <pic:cNvPicPr/>
                         </pic:nvPicPr>
                         <pic:blipFill>
-                          <a:blip r:embed="rId44" cstate="print">
+                          <a:blip r:embed="rId46" cstate="print">
                             <a:extLst>
                               <a:ext uri="{28A0092B-C50C-407E-A947-70E740481C1C}">
                                 <a14:useLocalDpi xmlns:a14="http://schemas.microsoft.com/office/drawing/2010/main" val="0"/>
@@ -17892,7 +18612,6 @@
               <w:rPr>
                 <w:sz w:val="24"/>
                 <w:szCs w:val="24"/>
-                <w:lang w:val="en-US"/>
               </w:rPr>
             </w:pPr>
             <w:r>
@@ -17909,7 +18628,6 @@
               <w:rPr>
                 <w:sz w:val="24"/>
                 <w:szCs w:val="24"/>
-                <w:lang w:val="en-US"/>
               </w:rPr>
             </w:pPr>
           </w:p>
@@ -18404,7 +19122,7 @@
                 <w:lang w:val="en-US"/>
               </w:rPr>
               <w:drawing>
-                <wp:inline distT="0" distB="0" distL="0" distR="0" wp14:anchorId="41D5B8A7" wp14:editId="4F40EDCE">
+                <wp:inline distT="0" distB="0" distL="0" distR="0" wp14:anchorId="41D5B8A7" wp14:editId="22ECAFF0">
                   <wp:extent cx="978196" cy="2459466"/>
                   <wp:effectExtent l="0" t="0" r="0" b="4445"/>
                   <wp:docPr id="1301891804" name="Рисунок 43" descr="Изображение выглядит как текст, снимок экрана, число, Шрифт&#10;&#10;Содержимое, созданное искусственным интеллектом, может быть неверным."/>
@@ -18419,7 +19137,7 @@
                           <pic:cNvPicPr/>
                         </pic:nvPicPr>
                         <pic:blipFill>
-                          <a:blip r:embed="rId46" cstate="print">
+                          <a:blip r:embed="rId48" cstate="print">
                             <a:extLst>
                               <a:ext uri="{28A0092B-C50C-407E-A947-70E740481C1C}">
                                 <a14:useLocalDpi xmlns:a14="http://schemas.microsoft.com/office/drawing/2010/main" val="0"/>
@@ -18461,10 +19179,7 @@
         <w:t>2.5.4.</w:t>
       </w:r>
       <w:r>
-        <w:t xml:space="preserve"> </w:t>
-      </w:r>
-      <w:r>
-        <w:t>Использование фразы HAVING</w:t>
+        <w:t xml:space="preserve"> Использование фразы HAVING</w:t>
       </w:r>
     </w:p>
     <w:p/>
@@ -18607,6 +19322,7 @@
                 <w:rFonts w:ascii="Cascadia Mono" w:hAnsi="Cascadia Mono"/>
                 <w:sz w:val="20"/>
                 <w:szCs w:val="20"/>
+                <w:lang w:val="en-US"/>
               </w:rPr>
             </w:pPr>
             <w:r>
@@ -18632,6 +19348,7 @@
                 <w:rFonts w:ascii="Cascadia Mono" w:hAnsi="Cascadia Mono"/>
                 <w:sz w:val="20"/>
                 <w:szCs w:val="20"/>
+                <w:lang w:val="en-US"/>
               </w:rPr>
               <w:t xml:space="preserve">    </w:t>
             </w:r>
@@ -18652,6 +19369,7 @@
                 <w:rFonts w:ascii="Cascadia Mono" w:hAnsi="Cascadia Mono"/>
                 <w:sz w:val="20"/>
                 <w:szCs w:val="20"/>
+                <w:lang w:val="en-US"/>
               </w:rPr>
             </w:pPr>
             <w:r>
@@ -18689,6 +19407,7 @@
                 <w:rFonts w:ascii="Cascadia Mono" w:hAnsi="Cascadia Mono"/>
                 <w:sz w:val="20"/>
                 <w:szCs w:val="20"/>
+                <w:lang w:val="en-US"/>
               </w:rPr>
             </w:pPr>
             <w:r>
@@ -18798,7 +19517,7 @@
                 <w:lang w:val="en-US"/>
               </w:rPr>
               <w:drawing>
-                <wp:inline distT="0" distB="0" distL="0" distR="0" wp14:anchorId="618C28EC" wp14:editId="28337FDB">
+                <wp:inline distT="0" distB="0" distL="0" distR="0" wp14:anchorId="618C28EC" wp14:editId="79C202A7">
                   <wp:extent cx="406670" cy="643278"/>
                   <wp:effectExtent l="0" t="0" r="0" b="4445"/>
                   <wp:docPr id="116399689" name="Рисунок 51" descr="Изображение выглядит как снимок экрана, Прямоугольник, линия, прямоугольный&#10;&#10;Содержимое, созданное искусственным интеллектом, может быть неверным."/>
@@ -18813,7 +19532,7 @@
                           <pic:cNvPicPr/>
                         </pic:nvPicPr>
                         <pic:blipFill>
-                          <a:blip r:embed="rId47" cstate="print">
+                          <a:blip r:embed="rId49" cstate="print">
                             <a:extLst>
                               <a:ext uri="{28A0092B-C50C-407E-A947-70E740481C1C}">
                                 <a14:useLocalDpi xmlns:a14="http://schemas.microsoft.com/office/drawing/2010/main" val="0"/>
@@ -19305,7 +20024,7 @@
                 <w:lang w:val="en-US"/>
               </w:rPr>
               <w:drawing>
-                <wp:inline distT="0" distB="0" distL="0" distR="0" wp14:anchorId="729B0C9A" wp14:editId="05B5C327">
+                <wp:inline distT="0" distB="0" distL="0" distR="0" wp14:anchorId="729B0C9A" wp14:editId="74F86EDD">
                   <wp:extent cx="4315906" cy="1568120"/>
                   <wp:effectExtent l="0" t="0" r="2540" b="0"/>
                   <wp:docPr id="2026495096" name="Рисунок 44" descr="Изображение выглядит как текст, снимок экрана, число, Шрифт&#10;&#10;Содержимое, созданное искусственным интеллектом, может быть неверным."/>
@@ -19320,7 +20039,7 @@
                           <pic:cNvPicPr/>
                         </pic:nvPicPr>
                         <pic:blipFill>
-                          <a:blip r:embed="rId48" cstate="print">
+                          <a:blip r:embed="rId50" cstate="print">
                             <a:extLst>
                               <a:ext uri="{28A0092B-C50C-407E-A947-70E740481C1C}">
                                 <a14:useLocalDpi xmlns:a14="http://schemas.microsoft.com/office/drawing/2010/main" val="0"/>
@@ -19869,7 +20588,6 @@
                 <w:rFonts w:ascii="Cascadia Mono" w:hAnsi="Cascadia Mono"/>
                 <w:sz w:val="20"/>
                 <w:szCs w:val="20"/>
-                <w:lang w:val="en-US"/>
               </w:rPr>
             </w:pPr>
             <w:r>
@@ -19930,7 +20648,6 @@
                 <w:rFonts w:ascii="Cascadia Mono" w:hAnsi="Cascadia Mono"/>
                 <w:sz w:val="20"/>
                 <w:szCs w:val="20"/>
-                <w:lang w:val="en-US"/>
               </w:rPr>
             </w:pPr>
           </w:p>
@@ -19981,7 +20698,7 @@
                 <w:lang w:val="en-US"/>
               </w:rPr>
               <w:drawing>
-                <wp:inline distT="0" distB="0" distL="0" distR="0" wp14:anchorId="290F6FED" wp14:editId="1B6ED388">
+                <wp:inline distT="0" distB="0" distL="0" distR="0" wp14:anchorId="290F6FED" wp14:editId="76214246">
                   <wp:extent cx="4267268" cy="1031808"/>
                   <wp:effectExtent l="0" t="0" r="0" b="0"/>
                   <wp:docPr id="1974737114" name="Рисунок 45" descr="Изображение выглядит как текст, снимок экрана, Шрифт, число&#10;&#10;Содержимое, созданное искусственным интеллектом, может быть неверным."/>
@@ -19996,7 +20713,7 @@
                           <pic:cNvPicPr/>
                         </pic:nvPicPr>
                         <pic:blipFill>
-                          <a:blip r:embed="rId49" cstate="print">
+                          <a:blip r:embed="rId51" cstate="print">
                             <a:extLst>
                               <a:ext uri="{28A0092B-C50C-407E-A947-70E740481C1C}">
                                 <a14:useLocalDpi xmlns:a14="http://schemas.microsoft.com/office/drawing/2010/main" val="0"/>
@@ -20449,7 +21166,7 @@
                 <w:lang w:val="en-US"/>
               </w:rPr>
               <w:drawing>
-                <wp:inline distT="0" distB="0" distL="0" distR="0" wp14:anchorId="781D3E58" wp14:editId="157575C6">
+                <wp:inline distT="0" distB="0" distL="0" distR="0" wp14:anchorId="781D3E58" wp14:editId="49D11BB8">
                   <wp:extent cx="2169268" cy="2870609"/>
                   <wp:effectExtent l="0" t="0" r="2540" b="0"/>
                   <wp:docPr id="2110843879" name="Рисунок 46" descr="Изображение выглядит как текст, снимок экрана, число, Шрифт&#10;&#10;Содержимое, созданное искусственным интеллектом, может быть неверным."/>
@@ -20464,7 +21181,7 @@
                           <pic:cNvPicPr/>
                         </pic:nvPicPr>
                         <pic:blipFill>
-                          <a:blip r:embed="rId50" cstate="print">
+                          <a:blip r:embed="rId52" cstate="print">
                             <a:extLst>
                               <a:ext uri="{28A0092B-C50C-407E-A947-70E740481C1C}">
                                 <a14:useLocalDpi xmlns:a14="http://schemas.microsoft.com/office/drawing/2010/main" val="0"/>
@@ -20774,7 +21491,7 @@
                 <w:lang w:val="en-US"/>
               </w:rPr>
               <w:drawing>
-                <wp:inline distT="0" distB="0" distL="0" distR="0" wp14:anchorId="1E9D8A79" wp14:editId="253A2066">
+                <wp:inline distT="0" distB="0" distL="0" distR="0" wp14:anchorId="1E9D8A79" wp14:editId="748FC04C">
                   <wp:extent cx="5015900" cy="2008505"/>
                   <wp:effectExtent l="0" t="0" r="635" b="0"/>
                   <wp:docPr id="1760588193" name="Рисунок 47" descr="Изображение выглядит как текст, число, снимок экрана, чек&#10;&#10;Содержимое, созданное искусственным интеллектом, может быть неверным."/>
@@ -20789,7 +21506,7 @@
                           <pic:cNvPicPr/>
                         </pic:nvPicPr>
                         <pic:blipFill>
-                          <a:blip r:embed="rId51" cstate="print">
+                          <a:blip r:embed="rId53" cstate="print">
                             <a:extLst>
                               <a:ext uri="{28A0092B-C50C-407E-A947-70E740481C1C}">
                                 <a14:useLocalDpi xmlns:a14="http://schemas.microsoft.com/office/drawing/2010/main" val="0"/>
@@ -20889,10 +21606,7 @@
         <w:t>3.2.2.</w:t>
       </w:r>
       <w:r>
-        <w:t xml:space="preserve"> </w:t>
-      </w:r>
-      <w:r>
-        <w:t>Эквисоединение таблиц</w:t>
+        <w:t xml:space="preserve"> Эквисоединение таблиц</w:t>
       </w:r>
     </w:p>
     <w:p/>
@@ -21188,7 +21902,6 @@
                 <w:rFonts w:ascii="Cascadia Mono" w:hAnsi="Cascadia Mono"/>
                 <w:sz w:val="20"/>
                 <w:szCs w:val="20"/>
-                <w:lang w:val="en-US"/>
               </w:rPr>
             </w:pPr>
             <w:r>
@@ -21224,7 +21937,6 @@
                 <w:rFonts w:ascii="Cascadia Mono" w:hAnsi="Cascadia Mono"/>
                 <w:sz w:val="20"/>
                 <w:szCs w:val="20"/>
-                <w:lang w:val="en-US"/>
               </w:rPr>
             </w:pPr>
           </w:p>
@@ -21275,7 +21987,7 @@
                 <w:lang w:val="en-US"/>
               </w:rPr>
               <w:drawing>
-                <wp:inline distT="0" distB="0" distL="0" distR="0" wp14:anchorId="78F2F73E" wp14:editId="5D63895C">
+                <wp:inline distT="0" distB="0" distL="0" distR="0" wp14:anchorId="78F2F73E" wp14:editId="7AF06CED">
                   <wp:extent cx="4996842" cy="2014761"/>
                   <wp:effectExtent l="0" t="0" r="0" b="5080"/>
                   <wp:docPr id="342517405" name="Рисунок 48" descr="Изображение выглядит как текст, снимок экрана, число&#10;&#10;Содержимое, созданное искусственным интеллектом, может быть неверным."/>
@@ -21290,7 +22002,7 @@
                           <pic:cNvPicPr/>
                         </pic:nvPicPr>
                         <pic:blipFill>
-                          <a:blip r:embed="rId52" cstate="print">
+                          <a:blip r:embed="rId54" cstate="print">
                             <a:extLst>
                               <a:ext uri="{28A0092B-C50C-407E-A947-70E740481C1C}">
                                 <a14:useLocalDpi xmlns:a14="http://schemas.microsoft.com/office/drawing/2010/main" val="0"/>
@@ -21653,6 +22365,7 @@
                 <w:rFonts w:ascii="Cascadia Mono" w:hAnsi="Cascadia Mono"/>
                 <w:sz w:val="20"/>
                 <w:szCs w:val="20"/>
+                <w:lang w:val="en-US"/>
               </w:rPr>
               <w:t xml:space="preserve">          </w:t>
             </w:r>
@@ -21914,7 +22627,6 @@
                 <w:rFonts w:ascii="Cascadia Mono" w:hAnsi="Cascadia Mono"/>
                 <w:sz w:val="20"/>
                 <w:szCs w:val="20"/>
-                <w:lang w:val="en-US"/>
               </w:rPr>
             </w:pPr>
             <w:r>
@@ -21950,7 +22662,6 @@
                 <w:rFonts w:ascii="Cascadia Mono" w:hAnsi="Cascadia Mono"/>
                 <w:sz w:val="20"/>
                 <w:szCs w:val="20"/>
-                <w:lang w:val="en-US"/>
               </w:rPr>
             </w:pPr>
           </w:p>
@@ -22001,7 +22712,7 @@
                 <w:lang w:val="en-US"/>
               </w:rPr>
               <w:drawing>
-                <wp:inline distT="0" distB="0" distL="0" distR="0" wp14:anchorId="21603474" wp14:editId="02DF3420">
+                <wp:inline distT="0" distB="0" distL="0" distR="0" wp14:anchorId="21603474" wp14:editId="6FD935C3">
                   <wp:extent cx="4004621" cy="2819287"/>
                   <wp:effectExtent l="0" t="0" r="0" b="635"/>
                   <wp:docPr id="1767299644" name="Рисунок 52" descr="Изображение выглядит как текст, снимок экрана, число, Шрифт&#10;&#10;Содержимое, созданное искусственным интеллектом, может быть неверным."/>
@@ -22016,7 +22727,7 @@
                           <pic:cNvPicPr/>
                         </pic:nvPicPr>
                         <pic:blipFill>
-                          <a:blip r:embed="rId53" cstate="print">
+                          <a:blip r:embed="rId55" cstate="print">
                             <a:extLst>
                               <a:ext uri="{28A0092B-C50C-407E-A947-70E740481C1C}">
                                 <a14:useLocalDpi xmlns:a14="http://schemas.microsoft.com/office/drawing/2010/main" val="0"/>
@@ -22052,10 +22763,7 @@
         <w:t>3.2.4.</w:t>
       </w:r>
       <w:r>
-        <w:t xml:space="preserve"> </w:t>
-      </w:r>
-      <w:r>
-        <w:t>Композиция таблиц</w:t>
+        <w:t xml:space="preserve"> Композиция таблиц</w:t>
       </w:r>
     </w:p>
     <w:p/>
@@ -22336,7 +23044,6 @@
                 <w:rFonts w:ascii="Cascadia Mono" w:hAnsi="Cascadia Mono"/>
                 <w:sz w:val="20"/>
                 <w:szCs w:val="20"/>
-                <w:lang w:val="en-US"/>
               </w:rPr>
             </w:pPr>
             <w:r>
@@ -22372,7 +23079,6 @@
                 <w:rFonts w:ascii="Cascadia Mono" w:hAnsi="Cascadia Mono"/>
                 <w:sz w:val="20"/>
                 <w:szCs w:val="20"/>
-                <w:lang w:val="en-US"/>
               </w:rPr>
             </w:pPr>
           </w:p>
@@ -22423,7 +23129,7 @@
                 <w:lang w:val="en-US"/>
               </w:rPr>
               <w:drawing>
-                <wp:inline distT="0" distB="0" distL="0" distR="0" wp14:anchorId="6379583D" wp14:editId="39B6647F">
+                <wp:inline distT="0" distB="0" distL="0" distR="0" wp14:anchorId="6379583D" wp14:editId="246C7535">
                   <wp:extent cx="3991914" cy="2325168"/>
                   <wp:effectExtent l="0" t="0" r="0" b="0"/>
                   <wp:docPr id="1355675316" name="Рисунок 49" descr="Изображение выглядит как текст, снимок экрана, число, Шрифт&#10;&#10;Содержимое, созданное искусственным интеллектом, может быть неверным."/>
@@ -22438,7 +23144,7 @@
                           <pic:cNvPicPr/>
                         </pic:nvPicPr>
                         <pic:blipFill>
-                          <a:blip r:embed="rId54" cstate="print">
+                          <a:blip r:embed="rId56" cstate="print">
                             <a:extLst>
                               <a:ext uri="{28A0092B-C50C-407E-A947-70E740481C1C}">
                                 <a14:useLocalDpi xmlns:a14="http://schemas.microsoft.com/office/drawing/2010/main" val="0"/>
@@ -22744,7 +23450,7 @@
                 <w:lang w:val="en-US"/>
               </w:rPr>
               <w:drawing>
-                <wp:inline distT="0" distB="0" distL="0" distR="0" wp14:anchorId="3F9C5E01" wp14:editId="62B42A53">
+                <wp:inline distT="0" distB="0" distL="0" distR="0" wp14:anchorId="3F9C5E01" wp14:editId="701D0597">
                   <wp:extent cx="1899285" cy="778278"/>
                   <wp:effectExtent l="0" t="0" r="0" b="0"/>
                   <wp:docPr id="1304773801" name="Рисунок 50" descr="Изображение выглядит как текст, снимок экрана, число, Шрифт&#10;&#10;Содержимое, созданное искусственным интеллектом, может быть неверным."/>
@@ -22759,7 +23465,7 @@
                           <pic:cNvPicPr/>
                         </pic:nvPicPr>
                         <pic:blipFill>
-                          <a:blip r:embed="rId55" cstate="print">
+                          <a:blip r:embed="rId57" cstate="print">
                             <a:extLst>
                               <a:ext uri="{28A0092B-C50C-407E-A947-70E740481C1C}">
                                 <a14:useLocalDpi xmlns:a14="http://schemas.microsoft.com/office/drawing/2010/main" val="0"/>
@@ -22801,10 +23507,7 @@
         <w:t>3.2.6.</w:t>
       </w:r>
       <w:r>
-        <w:t xml:space="preserve"> </w:t>
-      </w:r>
-      <w:r>
-        <w:t>Соединение таблиц с дополнительным условием</w:t>
+        <w:t xml:space="preserve"> Соединение таблиц с дополнительным условием</w:t>
       </w:r>
     </w:p>
     <w:p/>
@@ -22946,7 +23649,6 @@
                 <w:rFonts w:ascii="Cascadia Mono" w:hAnsi="Cascadia Mono"/>
                 <w:sz w:val="20"/>
                 <w:szCs w:val="20"/>
-                <w:lang w:val="en-US"/>
               </w:rPr>
             </w:pPr>
             <w:r>
@@ -23233,7 +23935,6 @@
                 <w:rFonts w:ascii="Cascadia Mono" w:hAnsi="Cascadia Mono"/>
                 <w:sz w:val="20"/>
                 <w:szCs w:val="20"/>
-                <w:lang w:val="en-US"/>
               </w:rPr>
             </w:pPr>
             <w:r>
@@ -23261,7 +23962,6 @@
                 <w:rFonts w:ascii="Cascadia Mono" w:hAnsi="Cascadia Mono"/>
                 <w:sz w:val="20"/>
                 <w:szCs w:val="20"/>
-                <w:lang w:val="en-US"/>
               </w:rPr>
             </w:pPr>
           </w:p>
@@ -23313,7 +24013,7 @@
                 <w:lang w:val="en-US"/>
               </w:rPr>
               <w:drawing>
-                <wp:inline distT="0" distB="0" distL="0" distR="0" wp14:anchorId="7EF251D5" wp14:editId="0B195D4A">
+                <wp:inline distT="0" distB="0" distL="0" distR="0" wp14:anchorId="7EF251D5" wp14:editId="4428E66F">
                   <wp:extent cx="4656374" cy="1212997"/>
                   <wp:effectExtent l="0" t="0" r="5080" b="6350"/>
                   <wp:docPr id="1619439604" name="Рисунок 53" descr="Изображение выглядит как текст, число, Шрифт, линия&#10;&#10;Содержимое, созданное искусственным интеллектом, может быть неверным."/>
@@ -23328,7 +24028,7 @@
                           <pic:cNvPicPr/>
                         </pic:nvPicPr>
                         <pic:blipFill>
-                          <a:blip r:embed="rId56" cstate="print">
+                          <a:blip r:embed="rId58" cstate="print">
                             <a:extLst>
                               <a:ext uri="{28A0092B-C50C-407E-A947-70E740481C1C}">
                                 <a14:useLocalDpi xmlns:a14="http://schemas.microsoft.com/office/drawing/2010/main" val="0"/>
@@ -23364,10 +24064,7 @@
         <w:t>3.2.7.</w:t>
       </w:r>
       <w:r>
-        <w:t xml:space="preserve"> </w:t>
-      </w:r>
-      <w:r>
-        <w:t>Соединение таблицы со своей копией</w:t>
+        <w:t xml:space="preserve"> Соединение таблицы со своей копией</w:t>
       </w:r>
     </w:p>
     <w:p/>
@@ -23910,7 +24607,6 @@
                 <w:rFonts w:ascii="Cascadia Mono" w:hAnsi="Cascadia Mono"/>
                 <w:sz w:val="20"/>
                 <w:szCs w:val="20"/>
-                <w:lang w:val="en-US"/>
               </w:rPr>
             </w:pPr>
             <w:r>
@@ -23946,7 +24642,6 @@
                 <w:rFonts w:ascii="Cascadia Mono" w:hAnsi="Cascadia Mono"/>
                 <w:sz w:val="20"/>
                 <w:szCs w:val="20"/>
-                <w:lang w:val="en-US"/>
               </w:rPr>
             </w:pPr>
           </w:p>
@@ -23997,7 +24692,7 @@
                 <w:lang w:val="en-US"/>
               </w:rPr>
               <w:drawing>
-                <wp:inline distT="0" distB="0" distL="0" distR="0" wp14:anchorId="3FCCE2F2" wp14:editId="5F3874FF">
+                <wp:inline distT="0" distB="0" distL="0" distR="0" wp14:anchorId="3FCCE2F2" wp14:editId="002C7248">
                   <wp:extent cx="4515663" cy="2680436"/>
                   <wp:effectExtent l="0" t="0" r="5715" b="0"/>
                   <wp:docPr id="2020810917" name="Рисунок 54"/>
@@ -24012,7 +24707,7 @@
                           <pic:cNvPicPr/>
                         </pic:nvPicPr>
                         <pic:blipFill>
-                          <a:blip r:embed="rId57" cstate="print">
+                          <a:blip r:embed="rId59" cstate="print">
                             <a:extLst>
                               <a:ext uri="{28A0092B-C50C-407E-A947-70E740481C1C}">
                                 <a14:useLocalDpi xmlns:a14="http://schemas.microsoft.com/office/drawing/2010/main" val="0"/>
@@ -24048,13 +24743,330 @@
       </w:pPr>
     </w:p>
     <w:sectPr>
+      <w:headerReference w:type="even" r:id="rId60"/>
+      <w:headerReference w:type="default" r:id="rId61"/>
+      <w:headerReference w:type="first" r:id="rId62"/>
+      <w:footerReference w:type="first" r:id="rId63"/>
       <w:pgSz w:w="11906" w:h="16838"/>
-      <w:pgMar w:top="1134" w:right="850" w:bottom="1134" w:left="1701" w:header="708" w:footer="708" w:gutter="0"/>
+      <w:pgMar w:top="1134" w:right="567" w:bottom="1134" w:left="1701" w:header="708" w:footer="708" w:gutter="0"/>
       <w:cols w:space="708"/>
-      <w:docGrid w:linePitch="360"/>
+      <w:titlePg/>
+      <w:docGrid w:linePitch="381"/>
     </w:sectPr>
   </w:body>
 </w:document>
+</file>
+
+<file path=word/endnotes.xml><?xml version="1.0" encoding="utf-8"?>
+<w:endnotes xmlns:wpc="http://schemas.microsoft.com/office/word/2010/wordprocessingCanvas" xmlns:cx="http://schemas.microsoft.com/office/drawing/2014/chartex" xmlns:cx1="http://schemas.microsoft.com/office/drawing/2015/9/8/chartex" xmlns:cx2="http://schemas.microsoft.com/office/drawing/2015/10/21/chartex" xmlns:cx3="http://schemas.microsoft.com/office/drawing/2016/5/9/chartex" xmlns:cx4="http://schemas.microsoft.com/office/drawing/2016/5/10/chartex" xmlns:cx5="http://schemas.microsoft.com/office/drawing/2016/5/11/chartex" xmlns:cx6="http://schemas.microsoft.com/office/drawing/2016/5/12/chartex" xmlns:cx7="http://schemas.microsoft.com/office/drawing/2016/5/13/chartex" xmlns:cx8="http://schemas.microsoft.com/office/drawing/2016/5/14/chartex" xmlns:mc="http://schemas.openxmlformats.org/markup-compatibility/2006" xmlns:aink="http://schemas.microsoft.com/office/drawing/2016/ink" xmlns:am3d="http://schemas.microsoft.com/office/drawing/2017/model3d" xmlns:o="urn:schemas-microsoft-com:office:office" xmlns:oel="http://schemas.microsoft.com/office/2019/extlst" xmlns:r="http://schemas.openxmlformats.org/officeDocument/2006/relationships" xmlns:m="http://schemas.openxmlformats.org/officeDocument/2006/math" xmlns:v="urn:schemas-microsoft-com:vml" xmlns:wp14="http://schemas.microsoft.com/office/word/2010/wordprocessingDrawing" xmlns:wp="http://schemas.openxmlformats.org/drawingml/2006/wordprocessingDrawing" xmlns:w10="urn:schemas-microsoft-com:office:word" xmlns:w="http://schemas.openxmlformats.org/wordprocessingml/2006/main" xmlns:w14="http://schemas.microsoft.com/office/word/2010/wordml" xmlns:w15="http://schemas.microsoft.com/office/word/2012/wordml" xmlns:w16cex="http://schemas.microsoft.com/office/word/2018/wordml/cex" xmlns:w16cid="http://schemas.microsoft.com/office/word/2016/wordml/cid" xmlns:w16="http://schemas.microsoft.com/office/word/2018/wordml" xmlns:w16du="http://schemas.microsoft.com/office/word/2023/wordml/word16du" xmlns:w16sdtdh="http://schemas.microsoft.com/office/word/2020/wordml/sdtdatahash" xmlns:w16sdtfl="http://schemas.microsoft.com/office/word/2024/wordml/sdtformatlock" xmlns:w16se="http://schemas.microsoft.com/office/word/2015/wordml/symex" xmlns:wpg="http://schemas.microsoft.com/office/word/2010/wordprocessingGroup" xmlns:wpi="http://schemas.microsoft.com/office/word/2010/wordprocessingInk" xmlns:wne="http://schemas.microsoft.com/office/word/2006/wordml" xmlns:wps="http://schemas.microsoft.com/office/word/2010/wordprocessingShape" mc:Ignorable="w14 w15 w16se w16cid w16 w16cex w16sdtdh w16sdtfl w16du wp14">
+  <w:endnote w:type="separator" w:id="-1">
+    <w:p>
+      <w:r>
+        <w:separator/>
+      </w:r>
+    </w:p>
+  </w:endnote>
+  <w:endnote w:type="continuationSeparator" w:id="0">
+    <w:p>
+      <w:r>
+        <w:continuationSeparator/>
+      </w:r>
+    </w:p>
+  </w:endnote>
+</w:endnotes>
+</file>
+
+<file path=word/footer1.xml><?xml version="1.0" encoding="utf-8"?>
+<w:ftr xmlns:wpc="http://schemas.microsoft.com/office/word/2010/wordprocessingCanvas" xmlns:cx="http://schemas.microsoft.com/office/drawing/2014/chartex" xmlns:cx1="http://schemas.microsoft.com/office/drawing/2015/9/8/chartex" xmlns:cx2="http://schemas.microsoft.com/office/drawing/2015/10/21/chartex" xmlns:cx3="http://schemas.microsoft.com/office/drawing/2016/5/9/chartex" xmlns:cx4="http://schemas.microsoft.com/office/drawing/2016/5/10/chartex" xmlns:cx5="http://schemas.microsoft.com/office/drawing/2016/5/11/chartex" xmlns:cx6="http://schemas.microsoft.com/office/drawing/2016/5/12/chartex" xmlns:cx7="http://schemas.microsoft.com/office/drawing/2016/5/13/chartex" xmlns:cx8="http://schemas.microsoft.com/office/drawing/2016/5/14/chartex" xmlns:mc="http://schemas.openxmlformats.org/markup-compatibility/2006" xmlns:aink="http://schemas.microsoft.com/office/drawing/2016/ink" xmlns:am3d="http://schemas.microsoft.com/office/drawing/2017/model3d" xmlns:o="urn:schemas-microsoft-com:office:office" xmlns:oel="http://schemas.microsoft.com/office/2019/extlst" xmlns:r="http://schemas.openxmlformats.org/officeDocument/2006/relationships" xmlns:m="http://schemas.openxmlformats.org/officeDocument/2006/math" xmlns:v="urn:schemas-microsoft-com:vml" xmlns:wp14="http://schemas.microsoft.com/office/word/2010/wordprocessingDrawing" xmlns:wp="http://schemas.openxmlformats.org/drawingml/2006/wordprocessingDrawing" xmlns:w10="urn:schemas-microsoft-com:office:word" xmlns:w="http://schemas.openxmlformats.org/wordprocessingml/2006/main" xmlns:w14="http://schemas.microsoft.com/office/word/2010/wordml" xmlns:w15="http://schemas.microsoft.com/office/word/2012/wordml" xmlns:w16cex="http://schemas.microsoft.com/office/word/2018/wordml/cex" xmlns:w16cid="http://schemas.microsoft.com/office/word/2016/wordml/cid" xmlns:w16="http://schemas.microsoft.com/office/word/2018/wordml" xmlns:w16du="http://schemas.microsoft.com/office/word/2023/wordml/word16du" xmlns:w16sdtdh="http://schemas.microsoft.com/office/word/2020/wordml/sdtdatahash" xmlns:w16sdtfl="http://schemas.microsoft.com/office/word/2024/wordml/sdtformatlock" xmlns:w16se="http://schemas.microsoft.com/office/word/2015/wordml/symex" xmlns:wpg="http://schemas.microsoft.com/office/word/2010/wordprocessingGroup" xmlns:wpi="http://schemas.microsoft.com/office/word/2010/wordprocessingInk" xmlns:wne="http://schemas.microsoft.com/office/word/2006/wordml" xmlns:wps="http://schemas.microsoft.com/office/word/2010/wordprocessingShape" mc:Ignorable="w14 w15 w16se w16cid w16 w16cex w16sdtdh w16sdtfl w16du wp14">
+  <w:p>
+    <w:pPr>
+      <w:pStyle w:val="ab"/>
+      <w:jc w:val="center"/>
+      <w:rPr>
+        <w:lang w:val="en-US"/>
+      </w:rPr>
+    </w:pPr>
+    <w:r>
+      <w:rPr>
+        <w:rFonts w:eastAsia="Times New Roman" w:cs="Times New Roman"/>
+        <w:szCs w:val="28"/>
+        <w:lang w:eastAsia="ru-RU"/>
+      </w:rPr>
+      <w:t>Череповец, 2025 г.</w:t>
+    </w:r>
+  </w:p>
+</w:ftr>
+</file>
+
+<file path=word/footnotes.xml><?xml version="1.0" encoding="utf-8"?>
+<w:footnotes xmlns:wpc="http://schemas.microsoft.com/office/word/2010/wordprocessingCanvas" xmlns:cx="http://schemas.microsoft.com/office/drawing/2014/chartex" xmlns:cx1="http://schemas.microsoft.com/office/drawing/2015/9/8/chartex" xmlns:cx2="http://schemas.microsoft.com/office/drawing/2015/10/21/chartex" xmlns:cx3="http://schemas.microsoft.com/office/drawing/2016/5/9/chartex" xmlns:cx4="http://schemas.microsoft.com/office/drawing/2016/5/10/chartex" xmlns:cx5="http://schemas.microsoft.com/office/drawing/2016/5/11/chartex" xmlns:cx6="http://schemas.microsoft.com/office/drawing/2016/5/12/chartex" xmlns:cx7="http://schemas.microsoft.com/office/drawing/2016/5/13/chartex" xmlns:cx8="http://schemas.microsoft.com/office/drawing/2016/5/14/chartex" xmlns:mc="http://schemas.openxmlformats.org/markup-compatibility/2006" xmlns:aink="http://schemas.microsoft.com/office/drawing/2016/ink" xmlns:am3d="http://schemas.microsoft.com/office/drawing/2017/model3d" xmlns:o="urn:schemas-microsoft-com:office:office" xmlns:oel="http://schemas.microsoft.com/office/2019/extlst" xmlns:r="http://schemas.openxmlformats.org/officeDocument/2006/relationships" xmlns:m="http://schemas.openxmlformats.org/officeDocument/2006/math" xmlns:v="urn:schemas-microsoft-com:vml" xmlns:wp14="http://schemas.microsoft.com/office/word/2010/wordprocessingDrawing" xmlns:wp="http://schemas.openxmlformats.org/drawingml/2006/wordprocessingDrawing" xmlns:w10="urn:schemas-microsoft-com:office:word" xmlns:w="http://schemas.openxmlformats.org/wordprocessingml/2006/main" xmlns:w14="http://schemas.microsoft.com/office/word/2010/wordml" xmlns:w15="http://schemas.microsoft.com/office/word/2012/wordml" xmlns:w16cex="http://schemas.microsoft.com/office/word/2018/wordml/cex" xmlns:w16cid="http://schemas.microsoft.com/office/word/2016/wordml/cid" xmlns:w16="http://schemas.microsoft.com/office/word/2018/wordml" xmlns:w16du="http://schemas.microsoft.com/office/word/2023/wordml/word16du" xmlns:w16sdtdh="http://schemas.microsoft.com/office/word/2020/wordml/sdtdatahash" xmlns:w16sdtfl="http://schemas.microsoft.com/office/word/2024/wordml/sdtformatlock" xmlns:w16se="http://schemas.microsoft.com/office/word/2015/wordml/symex" xmlns:wpg="http://schemas.microsoft.com/office/word/2010/wordprocessingGroup" xmlns:wpi="http://schemas.microsoft.com/office/word/2010/wordprocessingInk" xmlns:wne="http://schemas.microsoft.com/office/word/2006/wordml" xmlns:wps="http://schemas.microsoft.com/office/word/2010/wordprocessingShape" mc:Ignorable="w14 w15 w16se w16cid w16 w16cex w16sdtdh w16sdtfl w16du wp14">
+  <w:footnote w:type="separator" w:id="-1">
+    <w:p>
+      <w:r>
+        <w:separator/>
+      </w:r>
+    </w:p>
+  </w:footnote>
+  <w:footnote w:type="continuationSeparator" w:id="0">
+    <w:p>
+      <w:r>
+        <w:continuationSeparator/>
+      </w:r>
+    </w:p>
+  </w:footnote>
+</w:footnotes>
+</file>
+
+<file path=word/header1.xml><?xml version="1.0" encoding="utf-8"?>
+<w:hdr xmlns:wpc="http://schemas.microsoft.com/office/word/2010/wordprocessingCanvas" xmlns:cx="http://schemas.microsoft.com/office/drawing/2014/chartex" xmlns:cx1="http://schemas.microsoft.com/office/drawing/2015/9/8/chartex" xmlns:cx2="http://schemas.microsoft.com/office/drawing/2015/10/21/chartex" xmlns:cx3="http://schemas.microsoft.com/office/drawing/2016/5/9/chartex" xmlns:cx4="http://schemas.microsoft.com/office/drawing/2016/5/10/chartex" xmlns:cx5="http://schemas.microsoft.com/office/drawing/2016/5/11/chartex" xmlns:cx6="http://schemas.microsoft.com/office/drawing/2016/5/12/chartex" xmlns:cx7="http://schemas.microsoft.com/office/drawing/2016/5/13/chartex" xmlns:cx8="http://schemas.microsoft.com/office/drawing/2016/5/14/chartex" xmlns:mc="http://schemas.openxmlformats.org/markup-compatibility/2006" xmlns:aink="http://schemas.microsoft.com/office/drawing/2016/ink" xmlns:am3d="http://schemas.microsoft.com/office/drawing/2017/model3d" xmlns:o="urn:schemas-microsoft-com:office:office" xmlns:oel="http://schemas.microsoft.com/office/2019/extlst" xmlns:r="http://schemas.openxmlformats.org/officeDocument/2006/relationships" xmlns:m="http://schemas.openxmlformats.org/officeDocument/2006/math" xmlns:v="urn:schemas-microsoft-com:vml" xmlns:wp14="http://schemas.microsoft.com/office/word/2010/wordprocessingDrawing" xmlns:wp="http://schemas.openxmlformats.org/drawingml/2006/wordprocessingDrawing" xmlns:w10="urn:schemas-microsoft-com:office:word" xmlns:w="http://schemas.openxmlformats.org/wordprocessingml/2006/main" xmlns:w14="http://schemas.microsoft.com/office/word/2010/wordml" xmlns:w15="http://schemas.microsoft.com/office/word/2012/wordml" xmlns:w16cex="http://schemas.microsoft.com/office/word/2018/wordml/cex" xmlns:w16cid="http://schemas.microsoft.com/office/word/2016/wordml/cid" xmlns:w16="http://schemas.microsoft.com/office/word/2018/wordml" xmlns:w16du="http://schemas.microsoft.com/office/word/2023/wordml/word16du" xmlns:w16sdtdh="http://schemas.microsoft.com/office/word/2020/wordml/sdtdatahash" xmlns:w16sdtfl="http://schemas.microsoft.com/office/word/2024/wordml/sdtformatlock" xmlns:w16se="http://schemas.microsoft.com/office/word/2015/wordml/symex" xmlns:wpg="http://schemas.microsoft.com/office/word/2010/wordprocessingGroup" xmlns:wpi="http://schemas.microsoft.com/office/word/2010/wordprocessingInk" xmlns:wne="http://schemas.microsoft.com/office/word/2006/wordml" xmlns:wps="http://schemas.microsoft.com/office/word/2010/wordprocessingShape" mc:Ignorable="w14 w15 w16se w16cid w16 w16cex w16sdtdh w16sdtfl w16du wp14">
+  <w:sdt>
+    <w:sdtPr>
+      <w:rPr>
+        <w:rStyle w:val="ad"/>
+      </w:rPr>
+      <w:id w:val="690192621"/>
+      <w:docPartObj>
+        <w:docPartGallery w:val="Page Numbers (Top of Page)"/>
+        <w:docPartUnique/>
+      </w:docPartObj>
+    </w:sdtPr>
+    <w:sdtContent>
+      <w:p>
+        <w:pPr>
+          <w:pStyle w:val="a9"/>
+          <w:framePr w:wrap="none" w:vAnchor="text" w:hAnchor="margin" w:xAlign="center" w:y="1"/>
+          <w:rPr>
+            <w:rStyle w:val="ad"/>
+          </w:rPr>
+        </w:pPr>
+        <w:r>
+          <w:rPr>
+            <w:rStyle w:val="ad"/>
+          </w:rPr>
+          <w:fldChar w:fldCharType="begin"/>
+        </w:r>
+        <w:r>
+          <w:rPr>
+            <w:rStyle w:val="ad"/>
+          </w:rPr>
+          <w:instrText xml:space="preserve"> PAGE </w:instrText>
+        </w:r>
+        <w:r>
+          <w:rPr>
+            <w:rStyle w:val="ad"/>
+          </w:rPr>
+          <w:fldChar w:fldCharType="separate"/>
+        </w:r>
+        <w:r>
+          <w:rPr>
+            <w:rStyle w:val="ad"/>
+          </w:rPr>
+          <w:fldChar w:fldCharType="end"/>
+        </w:r>
+      </w:p>
+    </w:sdtContent>
+  </w:sdt>
+  <w:p>
+    <w:pPr>
+      <w:pStyle w:val="a9"/>
+    </w:pPr>
+  </w:p>
+</w:hdr>
+</file>
+
+<file path=word/header2.xml><?xml version="1.0" encoding="utf-8"?>
+<w:hdr xmlns:wpc="http://schemas.microsoft.com/office/word/2010/wordprocessingCanvas" xmlns:cx="http://schemas.microsoft.com/office/drawing/2014/chartex" xmlns:cx1="http://schemas.microsoft.com/office/drawing/2015/9/8/chartex" xmlns:cx2="http://schemas.microsoft.com/office/drawing/2015/10/21/chartex" xmlns:cx3="http://schemas.microsoft.com/office/drawing/2016/5/9/chartex" xmlns:cx4="http://schemas.microsoft.com/office/drawing/2016/5/10/chartex" xmlns:cx5="http://schemas.microsoft.com/office/drawing/2016/5/11/chartex" xmlns:cx6="http://schemas.microsoft.com/office/drawing/2016/5/12/chartex" xmlns:cx7="http://schemas.microsoft.com/office/drawing/2016/5/13/chartex" xmlns:cx8="http://schemas.microsoft.com/office/drawing/2016/5/14/chartex" xmlns:mc="http://schemas.openxmlformats.org/markup-compatibility/2006" xmlns:aink="http://schemas.microsoft.com/office/drawing/2016/ink" xmlns:am3d="http://schemas.microsoft.com/office/drawing/2017/model3d" xmlns:o="urn:schemas-microsoft-com:office:office" xmlns:oel="http://schemas.microsoft.com/office/2019/extlst" xmlns:r="http://schemas.openxmlformats.org/officeDocument/2006/relationships" xmlns:m="http://schemas.openxmlformats.org/officeDocument/2006/math" xmlns:v="urn:schemas-microsoft-com:vml" xmlns:wp14="http://schemas.microsoft.com/office/word/2010/wordprocessingDrawing" xmlns:wp="http://schemas.openxmlformats.org/drawingml/2006/wordprocessingDrawing" xmlns:w10="urn:schemas-microsoft-com:office:word" xmlns:w="http://schemas.openxmlformats.org/wordprocessingml/2006/main" xmlns:w14="http://schemas.microsoft.com/office/word/2010/wordml" xmlns:w15="http://schemas.microsoft.com/office/word/2012/wordml" xmlns:w16cex="http://schemas.microsoft.com/office/word/2018/wordml/cex" xmlns:w16cid="http://schemas.microsoft.com/office/word/2016/wordml/cid" xmlns:w16="http://schemas.microsoft.com/office/word/2018/wordml" xmlns:w16du="http://schemas.microsoft.com/office/word/2023/wordml/word16du" xmlns:w16sdtdh="http://schemas.microsoft.com/office/word/2020/wordml/sdtdatahash" xmlns:w16sdtfl="http://schemas.microsoft.com/office/word/2024/wordml/sdtformatlock" xmlns:w16se="http://schemas.microsoft.com/office/word/2015/wordml/symex" xmlns:wpg="http://schemas.microsoft.com/office/word/2010/wordprocessingGroup" xmlns:wpi="http://schemas.microsoft.com/office/word/2010/wordprocessingInk" xmlns:wne="http://schemas.microsoft.com/office/word/2006/wordml" xmlns:wps="http://schemas.microsoft.com/office/word/2010/wordprocessingShape" mc:Ignorable="w14 w15 w16se w16cid w16 w16cex w16sdtdh w16sdtfl w16du wp14">
+  <w:sdt>
+    <w:sdtPr>
+      <w:rPr>
+        <w:rStyle w:val="ad"/>
+      </w:rPr>
+      <w:id w:val="783538622"/>
+      <w:docPartObj>
+        <w:docPartGallery w:val="Page Numbers (Top of Page)"/>
+        <w:docPartUnique/>
+      </w:docPartObj>
+    </w:sdtPr>
+    <w:sdtContent>
+      <w:p>
+        <w:pPr>
+          <w:pStyle w:val="a9"/>
+          <w:framePr w:wrap="none" w:vAnchor="text" w:hAnchor="margin" w:xAlign="center" w:y="1"/>
+          <w:rPr>
+            <w:rStyle w:val="ad"/>
+          </w:rPr>
+        </w:pPr>
+        <w:r>
+          <w:rPr>
+            <w:rStyle w:val="ad"/>
+          </w:rPr>
+          <w:fldChar w:fldCharType="begin"/>
+        </w:r>
+        <w:r>
+          <w:rPr>
+            <w:rStyle w:val="ad"/>
+          </w:rPr>
+          <w:instrText xml:space="preserve"> PAGE </w:instrText>
+        </w:r>
+        <w:r>
+          <w:rPr>
+            <w:rStyle w:val="ad"/>
+          </w:rPr>
+          <w:fldChar w:fldCharType="separate"/>
+        </w:r>
+        <w:r>
+          <w:rPr>
+            <w:rStyle w:val="ad"/>
+            <w:noProof/>
+          </w:rPr>
+          <w:t>2</w:t>
+        </w:r>
+        <w:r>
+          <w:rPr>
+            <w:rStyle w:val="ad"/>
+          </w:rPr>
+          <w:fldChar w:fldCharType="end"/>
+        </w:r>
+      </w:p>
+    </w:sdtContent>
+  </w:sdt>
+  <w:p>
+    <w:pPr>
+      <w:pStyle w:val="a9"/>
+    </w:pPr>
+  </w:p>
+</w:hdr>
+</file>
+
+<file path=word/header3.xml><?xml version="1.0" encoding="utf-8"?>
+<w:hdr xmlns:wpc="http://schemas.microsoft.com/office/word/2010/wordprocessingCanvas" xmlns:cx="http://schemas.microsoft.com/office/drawing/2014/chartex" xmlns:cx1="http://schemas.microsoft.com/office/drawing/2015/9/8/chartex" xmlns:cx2="http://schemas.microsoft.com/office/drawing/2015/10/21/chartex" xmlns:cx3="http://schemas.microsoft.com/office/drawing/2016/5/9/chartex" xmlns:cx4="http://schemas.microsoft.com/office/drawing/2016/5/10/chartex" xmlns:cx5="http://schemas.microsoft.com/office/drawing/2016/5/11/chartex" xmlns:cx6="http://schemas.microsoft.com/office/drawing/2016/5/12/chartex" xmlns:cx7="http://schemas.microsoft.com/office/drawing/2016/5/13/chartex" xmlns:cx8="http://schemas.microsoft.com/office/drawing/2016/5/14/chartex" xmlns:mc="http://schemas.openxmlformats.org/markup-compatibility/2006" xmlns:aink="http://schemas.microsoft.com/office/drawing/2016/ink" xmlns:am3d="http://schemas.microsoft.com/office/drawing/2017/model3d" xmlns:o="urn:schemas-microsoft-com:office:office" xmlns:oel="http://schemas.microsoft.com/office/2019/extlst" xmlns:r="http://schemas.openxmlformats.org/officeDocument/2006/relationships" xmlns:m="http://schemas.openxmlformats.org/officeDocument/2006/math" xmlns:v="urn:schemas-microsoft-com:vml" xmlns:wp14="http://schemas.microsoft.com/office/word/2010/wordprocessingDrawing" xmlns:wp="http://schemas.openxmlformats.org/drawingml/2006/wordprocessingDrawing" xmlns:w10="urn:schemas-microsoft-com:office:word" xmlns:w="http://schemas.openxmlformats.org/wordprocessingml/2006/main" xmlns:w14="http://schemas.microsoft.com/office/word/2010/wordml" xmlns:w15="http://schemas.microsoft.com/office/word/2012/wordml" xmlns:w16cex="http://schemas.microsoft.com/office/word/2018/wordml/cex" xmlns:w16cid="http://schemas.microsoft.com/office/word/2016/wordml/cid" xmlns:w16="http://schemas.microsoft.com/office/word/2018/wordml" xmlns:w16du="http://schemas.microsoft.com/office/word/2023/wordml/word16du" xmlns:w16sdtdh="http://schemas.microsoft.com/office/word/2020/wordml/sdtdatahash" xmlns:w16sdtfl="http://schemas.microsoft.com/office/word/2024/wordml/sdtformatlock" xmlns:w16se="http://schemas.microsoft.com/office/word/2015/wordml/symex" xmlns:wpg="http://schemas.microsoft.com/office/word/2010/wordprocessingGroup" xmlns:wpi="http://schemas.microsoft.com/office/word/2010/wordprocessingInk" xmlns:wne="http://schemas.microsoft.com/office/word/2006/wordml" xmlns:wps="http://schemas.microsoft.com/office/word/2010/wordprocessingShape" mc:Ignorable="w14 w15 w16se w16cid w16 w16cex w16sdtdh w16sdtfl w16du wp14">
+  <w:p>
+    <w:pPr>
+      <w:ind w:right="754"/>
+      <w:jc w:val="center"/>
+      <w:rPr>
+        <w:rFonts w:cs="Times New Roman"/>
+      </w:rPr>
+    </w:pPr>
+    <w:r>
+      <w:rPr>
+        <w:rFonts w:cs="Times New Roman"/>
+      </w:rPr>
+      <w:t>МИНОБРНАУКИ</w:t>
+    </w:r>
+    <w:r>
+      <w:rPr>
+        <w:rFonts w:cs="Times New Roman"/>
+        <w:spacing w:val="-5"/>
+      </w:rPr>
+      <w:t xml:space="preserve"> </w:t>
+    </w:r>
+    <w:r>
+      <w:rPr>
+        <w:rFonts w:cs="Times New Roman"/>
+      </w:rPr>
+      <w:t>РОССИИ</w:t>
+    </w:r>
+  </w:p>
+  <w:p>
+    <w:pPr>
+      <w:spacing w:before="1"/>
+      <w:ind w:right="754"/>
+      <w:jc w:val="center"/>
+      <w:rPr>
+        <w:rFonts w:cs="Times New Roman"/>
+      </w:rPr>
+    </w:pPr>
+    <w:r>
+      <w:rPr>
+        <w:rFonts w:cs="Times New Roman"/>
+      </w:rPr>
+      <w:t>Федеральное государственное бюджетное образовательное учреждение</w:t>
+    </w:r>
+    <w:r>
+      <w:rPr>
+        <w:rFonts w:cs="Times New Roman"/>
+        <w:spacing w:val="-67"/>
+      </w:rPr>
+      <w:t xml:space="preserve"> </w:t>
+    </w:r>
+    <w:r>
+      <w:rPr>
+        <w:rFonts w:cs="Times New Roman"/>
+      </w:rPr>
+      <w:t>высшего</w:t>
+    </w:r>
+    <w:r>
+      <w:rPr>
+        <w:rFonts w:cs="Times New Roman"/>
+        <w:spacing w:val="-1"/>
+      </w:rPr>
+      <w:t xml:space="preserve"> </w:t>
+    </w:r>
+    <w:r>
+      <w:rPr>
+        <w:rFonts w:cs="Times New Roman"/>
+      </w:rPr>
+      <w:t>профессионального</w:t>
+    </w:r>
+    <w:r>
+      <w:rPr>
+        <w:rFonts w:cs="Times New Roman"/>
+        <w:spacing w:val="1"/>
+      </w:rPr>
+      <w:t xml:space="preserve"> </w:t>
+    </w:r>
+    <w:r>
+      <w:rPr>
+        <w:rFonts w:cs="Times New Roman"/>
+      </w:rPr>
+      <w:t>образования</w:t>
+    </w:r>
+  </w:p>
+  <w:p>
+    <w:pPr>
+      <w:spacing w:before="1"/>
+      <w:ind w:right="755"/>
+      <w:jc w:val="center"/>
+      <w:rPr>
+        <w:rFonts w:cs="Times New Roman"/>
+        <w:lang w:val="en-US"/>
+      </w:rPr>
+    </w:pPr>
+    <w:r>
+      <w:rPr>
+        <w:rFonts w:cs="Times New Roman"/>
+      </w:rPr>
+      <w:t>«ЧЕРЕПОВЕЦКИЙ</w:t>
+    </w:r>
+    <w:r>
+      <w:rPr>
+        <w:rFonts w:cs="Times New Roman"/>
+        <w:spacing w:val="-3"/>
+      </w:rPr>
+      <w:t xml:space="preserve"> </w:t>
+    </w:r>
+    <w:r>
+      <w:rPr>
+        <w:rFonts w:cs="Times New Roman"/>
+      </w:rPr>
+      <w:t>ГОСУДАРСТВЕННЫЙ</w:t>
+    </w:r>
+    <w:r>
+      <w:rPr>
+        <w:rFonts w:cs="Times New Roman"/>
+        <w:spacing w:val="-2"/>
+      </w:rPr>
+      <w:t xml:space="preserve"> </w:t>
+    </w:r>
+    <w:r>
+      <w:rPr>
+        <w:rFonts w:cs="Times New Roman"/>
+      </w:rPr>
+      <w:t>УНИВЕРСИТЕТ»</w:t>
+    </w:r>
+  </w:p>
+</w:hdr>
 </file>
 
 <file path=word/numbering.xml><?xml version="1.0" encoding="utf-8"?>
@@ -24732,6 +25744,64 @@
       <w:contextualSpacing/>
     </w:pPr>
   </w:style>
+  <w:style w:type="paragraph" w:styleId="a9">
+    <w:name w:val="header"/>
+    <w:basedOn w:val="a"/>
+    <w:link w:val="aa"/>
+    <w:uiPriority w:val="99"/>
+    <w:unhideWhenUsed/>
+    <w:rsid w:val="00FC5D3E"/>
+    <w:pPr>
+      <w:tabs>
+        <w:tab w:val="center" w:pos="4513"/>
+        <w:tab w:val="right" w:pos="9026"/>
+      </w:tabs>
+    </w:pPr>
+  </w:style>
+  <w:style w:type="character" w:customStyle="1" w:styleId="aa">
+    <w:name w:val="Верхний колонтитул Знак"/>
+    <w:basedOn w:val="a0"/>
+    <w:link w:val="a9"/>
+    <w:uiPriority w:val="99"/>
+    <w:rsid w:val="00FC5D3E"/>
+    <w:rPr>
+      <w:rFonts w:ascii="Times New Roman" w:hAnsi="Times New Roman"/>
+      <w:sz w:val="28"/>
+    </w:rPr>
+  </w:style>
+  <w:style w:type="paragraph" w:styleId="ab">
+    <w:name w:val="footer"/>
+    <w:basedOn w:val="a"/>
+    <w:link w:val="ac"/>
+    <w:uiPriority w:val="99"/>
+    <w:unhideWhenUsed/>
+    <w:rsid w:val="00FC5D3E"/>
+    <w:pPr>
+      <w:tabs>
+        <w:tab w:val="center" w:pos="4513"/>
+        <w:tab w:val="right" w:pos="9026"/>
+      </w:tabs>
+    </w:pPr>
+  </w:style>
+  <w:style w:type="character" w:customStyle="1" w:styleId="ac">
+    <w:name w:val="Нижний колонтитул Знак"/>
+    <w:basedOn w:val="a0"/>
+    <w:link w:val="ab"/>
+    <w:uiPriority w:val="99"/>
+    <w:rsid w:val="00FC5D3E"/>
+    <w:rPr>
+      <w:rFonts w:ascii="Times New Roman" w:hAnsi="Times New Roman"/>
+      <w:sz w:val="28"/>
+    </w:rPr>
+  </w:style>
+  <w:style w:type="character" w:styleId="ad">
+    <w:name w:val="page number"/>
+    <w:basedOn w:val="a0"/>
+    <w:uiPriority w:val="99"/>
+    <w:semiHidden/>
+    <w:unhideWhenUsed/>
+    <w:rsid w:val="008261D4"/>
+  </w:style>
 </w:styles>
 </file>
 

</xml_diff>